<commit_message>
feat(system-design-primer): implement MQTT bridge (9 topics + backpressure + AP failover + IR 38kHz + DHT11), Mobile App UI & ESP8266 firmware
</commit_message>
<xml_diff>
--- a/kenh_do_an_thay_duyet/BAO_CAO_DO_AN_CHUONG_1_2_3_SEEE_HUST.docx
+++ b/kenh_do_an_thay_duyet/BAO_CAO_DO_AN_CHUONG_1_2_3_SEEE_HUST.docx
@@ -13571,6 +13571,2472 @@
         <w:spacing w:after="120"/>
       </w:pPr>
     </w:p>
+    <w:p>
+      <w:r>
+        <w:br w:type="page"/>
+      </w:r>
+    </w:p>
+    <w:p>
+      <w:pPr>
+        <w:spacing w:before="120" w:after="280"/>
+        <w:jc w:val="center"/>
+      </w:pPr>
+      <w:r>
+        <w:rPr>
+          <w:rFonts w:ascii="Times New Roman" w:hAnsi="Times New Roman" w:eastAsia="Times New Roman"/>
+          <w:b/>
+          <w:i w:val="0"/>
+          <w:color w:val="000000"/>
+          <w:sz w:val="32"/>
+        </w:rPr>
+        <w:t>🏛️ ÁP DỤNG CHUẨN KIẾN TRÚC "THE SYSTEM DESIGN PRIMER" VÀO ĐỒ ÁN TỐT NGHIỆP</w:t>
+      </w:r>
+    </w:p>
+    <w:p>
+      <w:pPr>
+        <w:spacing w:line="312" w:lineRule="auto" w:after="120"/>
+        <w:ind w:firstLine="567"/>
+        <w:jc w:val="both"/>
+      </w:pPr>
+      <w:r>
+        <w:rPr>
+          <w:rFonts w:ascii="Times New Roman" w:hAnsi="Times New Roman" w:eastAsia="Times New Roman"/>
+          <w:b w:val="0"/>
+          <w:i w:val="0"/>
+          <w:color w:val="000000"/>
+          <w:sz w:val="26"/>
+        </w:rPr>
+        <w:t xml:space="preserve">Tài liệu này đối chiếu trực tiếp các nguyên lý thiết kế hệ thống cốt lõi từ kho tài liệu </w:t>
+      </w:r>
+      <w:r>
+        <w:rPr>
+          <w:rFonts w:ascii="Times New Roman" w:hAnsi="Times New Roman" w:eastAsia="Times New Roman"/>
+          <w:b/>
+          <w:i w:val="0"/>
+          <w:color w:val="000000"/>
+          <w:sz w:val="26"/>
+        </w:rPr>
+        <w:t>[The System Design Primer](file:///c:/Users/LENOVO/Desktop/%C4%91%E1%BB%93%20%C3%A1n%20t%E1%BB%91t%20nghi%E1%BB%87p/docs/tai_lieu_tham_khao/system-design-primer/README.md)</w:t>
+      </w:r>
+      <w:r>
+        <w:rPr>
+          <w:rFonts w:ascii="Times New Roman" w:hAnsi="Times New Roman" w:eastAsia="Times New Roman"/>
+          <w:b w:val="0"/>
+          <w:i w:val="0"/>
+          <w:color w:val="000000"/>
+          <w:sz w:val="26"/>
+        </w:rPr>
+        <w:t xml:space="preserve"> (đã tải đầy đủ về máy tại </w:t>
+      </w:r>
+      <w:r>
+        <w:rPr>
+          <w:rFonts w:ascii="Times New Roman" w:hAnsi="Times New Roman" w:eastAsia="Times New Roman"/>
+          <w:b/>
+          <w:i w:val="0"/>
+          <w:color w:val="000000"/>
+          <w:sz w:val="26"/>
+        </w:rPr>
+        <w:t>docs/tai_lieu_tham_khao/system-design-primer/</w:t>
+      </w:r>
+      <w:r>
+        <w:rPr>
+          <w:rFonts w:ascii="Times New Roman" w:hAnsi="Times New Roman" w:eastAsia="Times New Roman"/>
+          <w:b w:val="0"/>
+          <w:i w:val="0"/>
+          <w:color w:val="000000"/>
+          <w:sz w:val="26"/>
+        </w:rPr>
+        <w:t xml:space="preserve">) vào kiến trúc </w:t>
+      </w:r>
+      <w:r>
+        <w:rPr>
+          <w:rFonts w:ascii="Times New Roman" w:hAnsi="Times New Roman" w:eastAsia="Times New Roman"/>
+          <w:b/>
+          <w:i w:val="0"/>
+          <w:color w:val="000000"/>
+          <w:sz w:val="26"/>
+        </w:rPr>
+        <w:t>Hệ thống Nhà thông minh Giọng nói AI – Phân quyền 3 tầng – MQTT – ESP8266</w:t>
+      </w:r>
+      <w:r>
+        <w:rPr>
+          <w:rFonts w:ascii="Times New Roman" w:hAnsi="Times New Roman" w:eastAsia="Times New Roman"/>
+          <w:b w:val="0"/>
+          <w:i w:val="0"/>
+          <w:color w:val="000000"/>
+          <w:sz w:val="26"/>
+        </w:rPr>
+        <w:t xml:space="preserve"> của bạn.</w:t>
+      </w:r>
+    </w:p>
+    <w:p>
+      <w:pPr>
+        <w:spacing w:line="312" w:lineRule="auto" w:after="120"/>
+        <w:ind w:firstLine="567"/>
+        <w:jc w:val="both"/>
+      </w:pPr>
+      <w:r>
+        <w:rPr>
+          <w:rFonts w:ascii="Times New Roman" w:hAnsi="Times New Roman" w:eastAsia="Times New Roman"/>
+          <w:b w:val="0"/>
+          <w:i w:val="0"/>
+          <w:color w:val="000000"/>
+          <w:sz w:val="26"/>
+        </w:rPr>
+        <w:t xml:space="preserve">Khi bảo vệ trước Hội đồng hoặc giải thích Chương 2 (Phân tích &amp; Thiết kế) và Chương 3 (Triển khai MQTT &amp; Giao diện), bạn có thể dùng đúng khung </w:t>
+      </w:r>
+      <w:r>
+        <w:rPr>
+          <w:rFonts w:ascii="Times New Roman" w:hAnsi="Times New Roman" w:eastAsia="Times New Roman"/>
+          <w:b/>
+          <w:i w:val="0"/>
+          <w:color w:val="000000"/>
+          <w:sz w:val="26"/>
+        </w:rPr>
+        <w:t>4 Bước System Design Primer</w:t>
+      </w:r>
+      <w:r>
+        <w:rPr>
+          <w:rFonts w:ascii="Times New Roman" w:hAnsi="Times New Roman" w:eastAsia="Times New Roman"/>
+          <w:b w:val="0"/>
+          <w:i w:val="0"/>
+          <w:color w:val="000000"/>
+          <w:sz w:val="26"/>
+        </w:rPr>
+        <w:t xml:space="preserve"> dưới đây để trả lời mọi câu hỏi xoáy của các thầy:</w:t>
+      </w:r>
+    </w:p>
+    <w:p>
+      <w:pPr>
+        <w:spacing w:before="200" w:after="120"/>
+      </w:pPr>
+      <w:r>
+        <w:rPr>
+          <w:rFonts w:ascii="Times New Roman" w:hAnsi="Times New Roman" w:eastAsia="Times New Roman"/>
+          <w:b/>
+          <w:i w:val="0"/>
+          <w:color w:val="000000"/>
+          <w:sz w:val="28"/>
+        </w:rPr>
+        <w:t>BƯỚC 1: XÁC ĐỊNH USE CASES, RÀNG BUỘC &amp; THÔNG SỐ ĐỊNH LƯỢNG (CONSTRAINTS &amp; BACK-OF-THE-ENVELOPE ESTIMATES)</w:t>
+      </w:r>
+    </w:p>
+    <w:p>
+      <w:pPr>
+        <w:spacing w:line="312" w:lineRule="auto" w:after="120"/>
+        <w:ind w:firstLine="567"/>
+        <w:jc w:val="both"/>
+      </w:pPr>
+      <w:r>
+        <w:rPr>
+          <w:rFonts w:ascii="Times New Roman" w:hAnsi="Times New Roman" w:eastAsia="Times New Roman"/>
+          <w:b w:val="0"/>
+          <w:i w:val="0"/>
+          <w:color w:val="000000"/>
+          <w:sz w:val="26"/>
+        </w:rPr>
+        <w:t xml:space="preserve">Theo </w:t>
+      </w:r>
+      <w:r>
+        <w:rPr>
+          <w:rFonts w:ascii="Times New Roman" w:hAnsi="Times New Roman" w:eastAsia="Times New Roman"/>
+          <w:b w:val="0"/>
+          <w:i/>
+          <w:color w:val="000000"/>
+          <w:sz w:val="26"/>
+        </w:rPr>
+        <w:t>System Design Primer</w:t>
+      </w:r>
+      <w:r>
+        <w:rPr>
+          <w:rFonts w:ascii="Times New Roman" w:hAnsi="Times New Roman" w:eastAsia="Times New Roman"/>
+          <w:b w:val="0"/>
+          <w:i w:val="0"/>
+          <w:color w:val="000000"/>
+          <w:sz w:val="26"/>
+        </w:rPr>
+        <w:t>, mọi thiết kế tốt đều bắt đầu từ việc định lượng rõ đầu vào, đầu ra và ràng buộc độ trễ:</w:t>
+      </w:r>
+    </w:p>
+    <w:p>
+      <w:pPr>
+        <w:spacing w:line="312" w:lineRule="auto" w:after="120"/>
+        <w:ind w:left="425"/>
+        <w:jc w:val="both"/>
+      </w:pPr>
+      <w:r>
+        <w:rPr>
+          <w:rFonts w:ascii="Times New Roman" w:hAnsi="Times New Roman" w:eastAsia="Times New Roman"/>
+          <w:b w:val="0"/>
+          <w:i w:val="0"/>
+          <w:color w:val="000000"/>
+          <w:sz w:val="26"/>
+        </w:rPr>
+        <w:t xml:space="preserve">1. </w:t>
+      </w:r>
+      <w:r>
+        <w:rPr>
+          <w:rFonts w:ascii="Times New Roman" w:hAnsi="Times New Roman" w:eastAsia="Times New Roman"/>
+          <w:b/>
+          <w:i w:val="0"/>
+          <w:color w:val="000000"/>
+          <w:sz w:val="26"/>
+        </w:rPr>
+        <w:t>Băng thông luồng âm thanh thời gian thực (Audio Streaming Bandwidth):</w:t>
+      </w:r>
+    </w:p>
+    <w:p>
+      <w:pPr>
+        <w:spacing w:line="312" w:lineRule="auto" w:after="120"/>
+        <w:ind w:left="425"/>
+        <w:jc w:val="both"/>
+      </w:pPr>
+      <w:r>
+        <w:rPr>
+          <w:rFonts w:ascii="Times New Roman" w:hAnsi="Times New Roman" w:eastAsia="Times New Roman"/>
+          <w:b w:val="0"/>
+          <w:i w:val="0"/>
+          <w:color w:val="000000"/>
+          <w:sz w:val="26"/>
+        </w:rPr>
+        <w:t>- Tín hiệu thu âm chuẩn PCM 16-bit, đơn kênh (Mono), tần số lấy mẫu f_s = 16000\text{ Hz}:</w:t>
+      </w:r>
+    </w:p>
+    <w:p>
+      <w:pPr>
+        <w:spacing w:line="312" w:lineRule="auto" w:after="120"/>
+        <w:ind w:firstLine="567"/>
+        <w:jc w:val="both"/>
+      </w:pPr>
+      <w:r>
+        <w:rPr>
+          <w:rFonts w:ascii="Times New Roman" w:hAnsi="Times New Roman" w:eastAsia="Times New Roman"/>
+          <w:b w:val="0"/>
+          <w:i w:val="0"/>
+          <w:color w:val="000000"/>
+          <w:sz w:val="26"/>
+        </w:rPr>
+        <w:t>\text{Bitrate} = 16000\text{ mẫu/s} \times 16\text{ bit} = 256\text{ kbps} = 32\text{ KB/s}</w:t>
+      </w:r>
+    </w:p>
+    <w:p>
+      <w:pPr>
+        <w:spacing w:line="312" w:lineRule="auto" w:after="120"/>
+        <w:ind w:left="425"/>
+        <w:jc w:val="both"/>
+      </w:pPr>
+      <w:r>
+        <w:rPr>
+          <w:rFonts w:ascii="Times New Roman" w:hAnsi="Times New Roman" w:eastAsia="Times New Roman"/>
+          <w:b w:val="0"/>
+          <w:i w:val="0"/>
+          <w:color w:val="000000"/>
+          <w:sz w:val="26"/>
+        </w:rPr>
+        <w:t>- Chia theo từng khung (Chunk) 20\text{ ms} (320\text{ mẫu} = 640\text{ bytes/gói}) truyền qua WebSocket, đảm bảo không gây nghẽn bộ đệm mạng.</w:t>
+      </w:r>
+    </w:p>
+    <w:p>
+      <w:pPr>
+        <w:spacing w:line="312" w:lineRule="auto" w:after="120"/>
+        <w:ind w:left="425"/>
+        <w:jc w:val="both"/>
+      </w:pPr>
+      <w:r>
+        <w:rPr>
+          <w:rFonts w:ascii="Times New Roman" w:hAnsi="Times New Roman" w:eastAsia="Times New Roman"/>
+          <w:b w:val="0"/>
+          <w:i w:val="0"/>
+          <w:color w:val="000000"/>
+          <w:sz w:val="26"/>
+        </w:rPr>
+        <w:t xml:space="preserve">2. </w:t>
+      </w:r>
+      <w:r>
+        <w:rPr>
+          <w:rFonts w:ascii="Times New Roman" w:hAnsi="Times New Roman" w:eastAsia="Times New Roman"/>
+          <w:b/>
+          <w:i w:val="0"/>
+          <w:color w:val="000000"/>
+          <w:sz w:val="26"/>
+        </w:rPr>
+        <w:t>Tỷ lệ Đọc / Ghi (Read-to-Write Ratio):</w:t>
+      </w:r>
+    </w:p>
+    <w:p>
+      <w:pPr>
+        <w:spacing w:line="312" w:lineRule="auto" w:after="120"/>
+        <w:ind w:left="425"/>
+        <w:jc w:val="both"/>
+      </w:pPr>
+      <w:r>
+        <w:rPr>
+          <w:rFonts w:ascii="Times New Roman" w:hAnsi="Times New Roman" w:eastAsia="Times New Roman"/>
+          <w:b w:val="0"/>
+          <w:i w:val="0"/>
+          <w:color w:val="000000"/>
+          <w:sz w:val="26"/>
+        </w:rPr>
+        <w:t xml:space="preserve">- </w:t>
+      </w:r>
+      <w:r>
+        <w:rPr>
+          <w:rFonts w:ascii="Times New Roman" w:hAnsi="Times New Roman" w:eastAsia="Times New Roman"/>
+          <w:b/>
+          <w:i w:val="0"/>
+          <w:color w:val="000000"/>
+          <w:sz w:val="26"/>
+        </w:rPr>
+        <w:t>Luồng đọc trạng thái &amp; kiểm tra quyền (Read-heavy \approx 90\%):</w:t>
+      </w:r>
+      <w:r>
+        <w:rPr>
+          <w:rFonts w:ascii="Times New Roman" w:hAnsi="Times New Roman" w:eastAsia="Times New Roman"/>
+          <w:b w:val="0"/>
+          <w:i w:val="0"/>
+          <w:color w:val="000000"/>
+          <w:sz w:val="26"/>
+        </w:rPr>
+        <w:t xml:space="preserve"> Mỗi khi có giọng nói hoặc sự kiện cảm biến, hệ thống phải kiểm tra quyền 3 tầng, đọc Bể 1 (Hẹn giờ), Bể 2 (Luật IF-ELSE) và truy vấn Vector RAG 3072 chiều.</w:t>
+      </w:r>
+    </w:p>
+    <w:p>
+      <w:pPr>
+        <w:spacing w:line="312" w:lineRule="auto" w:after="120"/>
+        <w:ind w:left="425"/>
+        <w:jc w:val="both"/>
+      </w:pPr>
+      <w:r>
+        <w:rPr>
+          <w:rFonts w:ascii="Times New Roman" w:hAnsi="Times New Roman" w:eastAsia="Times New Roman"/>
+          <w:b w:val="0"/>
+          <w:i w:val="0"/>
+          <w:color w:val="000000"/>
+          <w:sz w:val="26"/>
+        </w:rPr>
+        <w:t xml:space="preserve">- </w:t>
+      </w:r>
+      <w:r>
+        <w:rPr>
+          <w:rFonts w:ascii="Times New Roman" w:hAnsi="Times New Roman" w:eastAsia="Times New Roman"/>
+          <w:b/>
+          <w:i w:val="0"/>
+          <w:color w:val="000000"/>
+          <w:sz w:val="26"/>
+        </w:rPr>
+        <w:t>Luồng ghi cấu hình (Write \approx 10\%):</w:t>
+      </w:r>
+      <w:r>
+        <w:rPr>
+          <w:rFonts w:ascii="Times New Roman" w:hAnsi="Times New Roman" w:eastAsia="Times New Roman"/>
+          <w:b w:val="0"/>
+          <w:i w:val="0"/>
+          <w:color w:val="000000"/>
+          <w:sz w:val="26"/>
+        </w:rPr>
+        <w:t xml:space="preserve"> Chỉ xảy ra khi đặt lịch mới, xét luật mới, thu âm cấp quyền mới hoặc khi Admin Cấp 1 sửa quy tắc hệ thống.</w:t>
+      </w:r>
+    </w:p>
+    <w:p>
+      <w:pPr>
+        <w:spacing w:before="200" w:after="120"/>
+      </w:pPr>
+      <w:r>
+        <w:rPr>
+          <w:rFonts w:ascii="Times New Roman" w:hAnsi="Times New Roman" w:eastAsia="Times New Roman"/>
+          <w:b/>
+          <w:i w:val="0"/>
+          <w:color w:val="000000"/>
+          <w:sz w:val="28"/>
+        </w:rPr>
+        <w:t>BƯỚC 2: CÁC ĐÁNH ĐỔI KIẾN TRÚC CỐT LÕI (ARCHITECTURAL TRADE-OFFS THEO SYSTEM DESIGN PRIMER)</w:t>
+      </w:r>
+    </w:p>
+    <w:p>
+      <w:pPr>
+        <w:spacing w:before="160" w:after="80"/>
+      </w:pPr>
+      <w:r>
+        <w:rPr>
+          <w:rFonts w:ascii="Times New Roman" w:hAnsi="Times New Roman" w:eastAsia="Times New Roman"/>
+          <w:b/>
+          <w:i w:val="0"/>
+          <w:color w:val="000000"/>
+          <w:sz w:val="26"/>
+        </w:rPr>
+        <w:t>2.1. Định lý CAP (CAP Theorem: Consistency vs Availability khi đứt mạng)</w:t>
+      </w:r>
+    </w:p>
+    <w:p>
+      <w:pPr>
+        <w:spacing w:line="312" w:lineRule="auto" w:after="120"/>
+        <w:ind w:firstLine="567"/>
+        <w:jc w:val="both"/>
+      </w:pPr>
+      <w:r>
+        <w:rPr>
+          <w:rFonts w:ascii="Times New Roman" w:hAnsi="Times New Roman" w:eastAsia="Times New Roman"/>
+          <w:b w:val="0"/>
+          <w:i w:val="0"/>
+          <w:color w:val="000000"/>
+          <w:sz w:val="26"/>
+        </w:rPr>
+        <w:t xml:space="preserve">Trong </w:t>
+      </w:r>
+      <w:r>
+        <w:rPr>
+          <w:rFonts w:ascii="Times New Roman" w:hAnsi="Times New Roman" w:eastAsia="Times New Roman"/>
+          <w:b w:val="0"/>
+          <w:i/>
+          <w:color w:val="000000"/>
+          <w:sz w:val="26"/>
+        </w:rPr>
+        <w:t>System Design Primer</w:t>
+      </w:r>
+      <w:r>
+        <w:rPr>
+          <w:rFonts w:ascii="Times New Roman" w:hAnsi="Times New Roman" w:eastAsia="Times New Roman"/>
+          <w:b w:val="0"/>
+          <w:i w:val="0"/>
+          <w:color w:val="000000"/>
+          <w:sz w:val="26"/>
+        </w:rPr>
+        <w:t xml:space="preserve"> (Mục </w:t>
+      </w:r>
+      <w:r>
+        <w:rPr>
+          <w:rFonts w:ascii="Times New Roman" w:hAnsi="Times New Roman" w:eastAsia="Times New Roman"/>
+          <w:b w:val="0"/>
+          <w:i/>
+          <w:color w:val="000000"/>
+          <w:sz w:val="26"/>
+        </w:rPr>
+        <w:t>Availability vs Consistency – CAP Theorem</w:t>
+      </w:r>
+      <w:r>
+        <w:rPr>
+          <w:rFonts w:ascii="Times New Roman" w:hAnsi="Times New Roman" w:eastAsia="Times New Roman"/>
+          <w:b w:val="0"/>
+          <w:i w:val="0"/>
+          <w:color w:val="000000"/>
+          <w:sz w:val="26"/>
+        </w:rPr>
+        <w:t xml:space="preserve">), một hệ thống phân tán giữa </w:t>
+      </w:r>
+      <w:r>
+        <w:rPr>
+          <w:rFonts w:ascii="Times New Roman" w:hAnsi="Times New Roman" w:eastAsia="Times New Roman"/>
+          <w:b/>
+          <w:i w:val="0"/>
+          <w:color w:val="000000"/>
+          <w:sz w:val="26"/>
+        </w:rPr>
+        <w:t>Server Trung tâm</w:t>
+      </w:r>
+      <w:r>
+        <w:rPr>
+          <w:rFonts w:ascii="Times New Roman" w:hAnsi="Times New Roman" w:eastAsia="Times New Roman"/>
+          <w:b w:val="0"/>
+          <w:i w:val="0"/>
+          <w:color w:val="000000"/>
+          <w:sz w:val="26"/>
+        </w:rPr>
+        <w:t xml:space="preserve"> và </w:t>
+      </w:r>
+      <w:r>
+        <w:rPr>
+          <w:rFonts w:ascii="Times New Roman" w:hAnsi="Times New Roman" w:eastAsia="Times New Roman"/>
+          <w:b/>
+          <w:i w:val="0"/>
+          <w:color w:val="000000"/>
+          <w:sz w:val="26"/>
+        </w:rPr>
+        <w:t>Trạm vi điều khiển biên (ESP8266)</w:t>
+      </w:r>
+      <w:r>
+        <w:rPr>
+          <w:rFonts w:ascii="Times New Roman" w:hAnsi="Times New Roman" w:eastAsia="Times New Roman"/>
+          <w:b w:val="0"/>
+          <w:i w:val="0"/>
+          <w:color w:val="000000"/>
+          <w:sz w:val="26"/>
+        </w:rPr>
+        <w:t xml:space="preserve"> khi xảy ra phân mảnh mạng (</w:t>
+      </w:r>
+      <w:r>
+        <w:rPr>
+          <w:rFonts w:ascii="Times New Roman" w:hAnsi="Times New Roman" w:eastAsia="Times New Roman"/>
+          <w:b/>
+          <w:i w:val="0"/>
+          <w:color w:val="000000"/>
+          <w:sz w:val="26"/>
+        </w:rPr>
+        <w:t>P – Network Partition</w:t>
+      </w:r>
+      <w:r>
+        <w:rPr>
+          <w:rFonts w:ascii="Times New Roman" w:hAnsi="Times New Roman" w:eastAsia="Times New Roman"/>
+          <w:b w:val="0"/>
+          <w:i w:val="0"/>
+          <w:color w:val="000000"/>
+          <w:sz w:val="26"/>
+        </w:rPr>
+        <w:t xml:space="preserve">, ví dụ mất kết nối Server hoặc tắt Laptop) phải lựa chọn giữa </w:t>
+      </w:r>
+      <w:r>
+        <w:rPr>
+          <w:rFonts w:ascii="Times New Roman" w:hAnsi="Times New Roman" w:eastAsia="Times New Roman"/>
+          <w:b/>
+          <w:i w:val="0"/>
+          <w:color w:val="000000"/>
+          <w:sz w:val="26"/>
+        </w:rPr>
+        <w:t>CP</w:t>
+      </w:r>
+      <w:r>
+        <w:rPr>
+          <w:rFonts w:ascii="Times New Roman" w:hAnsi="Times New Roman" w:eastAsia="Times New Roman"/>
+          <w:b w:val="0"/>
+          <w:i w:val="0"/>
+          <w:color w:val="000000"/>
+          <w:sz w:val="26"/>
+        </w:rPr>
+        <w:t xml:space="preserve"> và </w:t>
+      </w:r>
+      <w:r>
+        <w:rPr>
+          <w:rFonts w:ascii="Times New Roman" w:hAnsi="Times New Roman" w:eastAsia="Times New Roman"/>
+          <w:b/>
+          <w:i w:val="0"/>
+          <w:color w:val="000000"/>
+          <w:sz w:val="26"/>
+        </w:rPr>
+        <w:t>AP</w:t>
+      </w:r>
+      <w:r>
+        <w:rPr>
+          <w:rFonts w:ascii="Times New Roman" w:hAnsi="Times New Roman" w:eastAsia="Times New Roman"/>
+          <w:b w:val="0"/>
+          <w:i w:val="0"/>
+          <w:color w:val="000000"/>
+          <w:sz w:val="26"/>
+        </w:rPr>
+        <w:t>:</w:t>
+      </w:r>
+    </w:p>
+    <w:p>
+      <w:pPr>
+        <w:spacing w:line="312" w:lineRule="auto" w:after="120"/>
+        <w:ind w:left="425"/>
+        <w:jc w:val="both"/>
+      </w:pPr>
+      <w:r>
+        <w:rPr>
+          <w:rFonts w:ascii="Times New Roman" w:hAnsi="Times New Roman" w:eastAsia="Times New Roman"/>
+          <w:b w:val="0"/>
+          <w:i w:val="0"/>
+          <w:color w:val="000000"/>
+          <w:sz w:val="26"/>
+        </w:rPr>
+        <w:t xml:space="preserve">- </w:t>
+      </w:r>
+      <w:r>
+        <w:rPr>
+          <w:rFonts w:ascii="Times New Roman" w:hAnsi="Times New Roman" w:eastAsia="Times New Roman"/>
+          <w:b/>
+          <w:i w:val="0"/>
+          <w:color w:val="000000"/>
+          <w:sz w:val="26"/>
+        </w:rPr>
+        <w:t>Khi kết nối Wi-Fi/MQTT bình thường:</w:t>
+      </w:r>
+      <w:r>
+        <w:rPr>
+          <w:rFonts w:ascii="Times New Roman" w:hAnsi="Times New Roman" w:eastAsia="Times New Roman"/>
+          <w:b w:val="0"/>
+          <w:i w:val="0"/>
+          <w:color w:val="000000"/>
+          <w:sz w:val="26"/>
+        </w:rPr>
+        <w:t xml:space="preserve"> Hệ thống vận hành ở chế độ </w:t>
+      </w:r>
+      <w:r>
+        <w:rPr>
+          <w:rFonts w:ascii="Times New Roman" w:hAnsi="Times New Roman" w:eastAsia="Times New Roman"/>
+          <w:b/>
+          <w:i w:val="0"/>
+          <w:color w:val="000000"/>
+          <w:sz w:val="26"/>
+        </w:rPr>
+        <w:t>Strong Consistency</w:t>
+      </w:r>
+      <w:r>
+        <w:rPr>
+          <w:rFonts w:ascii="Times New Roman" w:hAnsi="Times New Roman" w:eastAsia="Times New Roman"/>
+          <w:b w:val="0"/>
+          <w:i w:val="0"/>
+          <w:color w:val="000000"/>
+          <w:sz w:val="26"/>
+        </w:rPr>
+        <w:t xml:space="preserve"> — mọi thay đổi trên Server, Web 3D, Mobile App và mạch ESP8266 được đồng bộ tức thì (&lt; 30\text{ ms}).</w:t>
+      </w:r>
+    </w:p>
+    <w:p>
+      <w:pPr>
+        <w:spacing w:line="312" w:lineRule="auto" w:after="120"/>
+        <w:ind w:left="425"/>
+        <w:jc w:val="both"/>
+      </w:pPr>
+      <w:r>
+        <w:rPr>
+          <w:rFonts w:ascii="Times New Roman" w:hAnsi="Times New Roman" w:eastAsia="Times New Roman"/>
+          <w:b w:val="0"/>
+          <w:i w:val="0"/>
+          <w:color w:val="000000"/>
+          <w:sz w:val="26"/>
+        </w:rPr>
+        <w:t xml:space="preserve">- </w:t>
+      </w:r>
+      <w:r>
+        <w:rPr>
+          <w:rFonts w:ascii="Times New Roman" w:hAnsi="Times New Roman" w:eastAsia="Times New Roman"/>
+          <w:b/>
+          <w:i w:val="0"/>
+          <w:color w:val="000000"/>
+          <w:sz w:val="26"/>
+        </w:rPr>
+        <w:t>Khi mất kết nối tới Server (Network Partition):</w:t>
+      </w:r>
+      <w:r>
+        <w:rPr>
+          <w:rFonts w:ascii="Times New Roman" w:hAnsi="Times New Roman" w:eastAsia="Times New Roman"/>
+          <w:b w:val="0"/>
+          <w:i w:val="0"/>
+          <w:color w:val="000000"/>
+          <w:sz w:val="26"/>
+        </w:rPr>
+        <w:t xml:space="preserve"> Hệ thống thiết kế theo mô hình </w:t>
+      </w:r>
+      <w:r>
+        <w:rPr>
+          <w:rFonts w:ascii="Times New Roman" w:hAnsi="Times New Roman" w:eastAsia="Times New Roman"/>
+          <w:b/>
+          <w:i w:val="0"/>
+          <w:color w:val="000000"/>
+          <w:sz w:val="26"/>
+        </w:rPr>
+        <w:t>AP (Availability + Partition Tolerance)</w:t>
+      </w:r>
+      <w:r>
+        <w:rPr>
+          <w:rFonts w:ascii="Times New Roman" w:hAnsi="Times New Roman" w:eastAsia="Times New Roman"/>
+          <w:b w:val="0"/>
+          <w:i w:val="0"/>
+          <w:color w:val="000000"/>
+          <w:sz w:val="26"/>
+        </w:rPr>
+        <w:t xml:space="preserve"> kết hợp </w:t>
+      </w:r>
+      <w:r>
+        <w:rPr>
+          <w:rFonts w:ascii="Times New Roman" w:hAnsi="Times New Roman" w:eastAsia="Times New Roman"/>
+          <w:b/>
+          <w:i w:val="0"/>
+          <w:color w:val="000000"/>
+          <w:sz w:val="26"/>
+        </w:rPr>
+        <w:t>Active-Passive Failover tại biên</w:t>
+      </w:r>
+      <w:r>
+        <w:rPr>
+          <w:rFonts w:ascii="Times New Roman" w:hAnsi="Times New Roman" w:eastAsia="Times New Roman"/>
+          <w:b w:val="0"/>
+          <w:i w:val="0"/>
+          <w:color w:val="000000"/>
+          <w:sz w:val="26"/>
+        </w:rPr>
+        <w:t>:</w:t>
+      </w:r>
+    </w:p>
+    <w:p>
+      <w:pPr>
+        <w:spacing w:line="312" w:lineRule="auto" w:after="120"/>
+        <w:ind w:left="425"/>
+        <w:jc w:val="both"/>
+      </w:pPr>
+      <w:r>
+        <w:rPr>
+          <w:rFonts w:ascii="Times New Roman" w:hAnsi="Times New Roman" w:eastAsia="Times New Roman"/>
+          <w:b w:val="0"/>
+          <w:i w:val="0"/>
+          <w:color w:val="000000"/>
+          <w:sz w:val="26"/>
+        </w:rPr>
+        <w:t xml:space="preserve">- Nhờ Topic MQTT </w:t>
+      </w:r>
+      <w:r>
+        <w:rPr>
+          <w:rFonts w:ascii="Times New Roman" w:hAnsi="Times New Roman" w:eastAsia="Times New Roman"/>
+          <w:b/>
+          <w:i w:val="0"/>
+          <w:color w:val="000000"/>
+          <w:sz w:val="26"/>
+        </w:rPr>
+        <w:t>smarthome/sync/pools</w:t>
+      </w:r>
+      <w:r>
+        <w:rPr>
+          <w:rFonts w:ascii="Times New Roman" w:hAnsi="Times New Roman" w:eastAsia="Times New Roman"/>
+          <w:b w:val="0"/>
+          <w:i w:val="0"/>
+          <w:color w:val="000000"/>
+          <w:sz w:val="26"/>
+        </w:rPr>
+        <w:t xml:space="preserve"> (</w:t>
+      </w:r>
+      <w:r>
+        <w:rPr>
+          <w:rFonts w:ascii="Times New Roman" w:hAnsi="Times New Roman" w:eastAsia="Times New Roman"/>
+          <w:b/>
+          <w:i w:val="0"/>
+          <w:color w:val="000000"/>
+          <w:sz w:val="26"/>
+        </w:rPr>
+        <w:t>Retain = True</w:t>
+      </w:r>
+      <w:r>
+        <w:rPr>
+          <w:rFonts w:ascii="Times New Roman" w:hAnsi="Times New Roman" w:eastAsia="Times New Roman"/>
+          <w:b w:val="0"/>
+          <w:i w:val="0"/>
+          <w:color w:val="000000"/>
+          <w:sz w:val="26"/>
+        </w:rPr>
+        <w:t xml:space="preserve">), mạch </w:t>
+      </w:r>
+      <w:r>
+        <w:rPr>
+          <w:rFonts w:ascii="Times New Roman" w:hAnsi="Times New Roman" w:eastAsia="Times New Roman"/>
+          <w:b/>
+          <w:i w:val="0"/>
+          <w:color w:val="000000"/>
+          <w:sz w:val="26"/>
+        </w:rPr>
+        <w:t>NodeMCU ESP8266</w:t>
+      </w:r>
+      <w:r>
+        <w:rPr>
+          <w:rFonts w:ascii="Times New Roman" w:hAnsi="Times New Roman" w:eastAsia="Times New Roman"/>
+          <w:b w:val="0"/>
+          <w:i w:val="0"/>
+          <w:color w:val="000000"/>
+          <w:sz w:val="26"/>
+        </w:rPr>
+        <w:t xml:space="preserve"> luôn giữ một bản sao (</w:t>
+      </w:r>
+      <w:r>
+        <w:rPr>
+          <w:rFonts w:ascii="Times New Roman" w:hAnsi="Times New Roman" w:eastAsia="Times New Roman"/>
+          <w:b/>
+          <w:i w:val="0"/>
+          <w:color w:val="000000"/>
+          <w:sz w:val="26"/>
+        </w:rPr>
+        <w:t>Replica</w:t>
+      </w:r>
+      <w:r>
+        <w:rPr>
+          <w:rFonts w:ascii="Times New Roman" w:hAnsi="Times New Roman" w:eastAsia="Times New Roman"/>
+          <w:b w:val="0"/>
+          <w:i w:val="0"/>
+          <w:color w:val="000000"/>
+          <w:sz w:val="26"/>
+        </w:rPr>
+        <w:t xml:space="preserve">) của Bể 1 (Hẹn giờ) và Bể 2 (Luật IF-ELSE) trong bộ nhớ Flash </w:t>
+      </w:r>
+      <w:r>
+        <w:rPr>
+          <w:rFonts w:ascii="Times New Roman" w:hAnsi="Times New Roman" w:eastAsia="Times New Roman"/>
+          <w:b/>
+          <w:i w:val="0"/>
+          <w:color w:val="000000"/>
+          <w:sz w:val="26"/>
+        </w:rPr>
+        <w:t>LittleFS</w:t>
+      </w:r>
+      <w:r>
+        <w:rPr>
+          <w:rFonts w:ascii="Times New Roman" w:hAnsi="Times New Roman" w:eastAsia="Times New Roman"/>
+          <w:b w:val="0"/>
+          <w:i w:val="0"/>
+          <w:color w:val="000000"/>
+          <w:sz w:val="26"/>
+        </w:rPr>
+        <w:t>.</w:t>
+      </w:r>
+    </w:p>
+    <w:p>
+      <w:pPr>
+        <w:spacing w:line="312" w:lineRule="auto" w:after="120"/>
+        <w:ind w:left="425"/>
+        <w:jc w:val="both"/>
+      </w:pPr>
+      <w:r>
+        <w:rPr>
+          <w:rFonts w:ascii="Times New Roman" w:hAnsi="Times New Roman" w:eastAsia="Times New Roman"/>
+          <w:b w:val="0"/>
+          <w:i w:val="0"/>
+          <w:color w:val="000000"/>
+          <w:sz w:val="26"/>
+        </w:rPr>
+        <w:t xml:space="preserve">- Ngay khi mất kết nối Server, ESP8266 tự động chuyển sang chế độ </w:t>
+      </w:r>
+      <w:r>
+        <w:rPr>
+          <w:rFonts w:ascii="Times New Roman" w:hAnsi="Times New Roman" w:eastAsia="Times New Roman"/>
+          <w:b/>
+          <w:i w:val="0"/>
+          <w:color w:val="000000"/>
+          <w:sz w:val="26"/>
+        </w:rPr>
+        <w:t>Edge Autonomous (Tự trị tại biên)</w:t>
+      </w:r>
+      <w:r>
+        <w:rPr>
+          <w:rFonts w:ascii="Times New Roman" w:hAnsi="Times New Roman" w:eastAsia="Times New Roman"/>
+          <w:b w:val="0"/>
+          <w:i w:val="0"/>
+          <w:color w:val="000000"/>
+          <w:sz w:val="26"/>
+        </w:rPr>
+        <w:t xml:space="preserve">, tiếp tục chạy đúng các lịch hẹn giờ (nhờ đồng hồ NTP nội bộ) và các luật liên động </w:t>
+      </w:r>
+      <w:r>
+        <w:rPr>
+          <w:rFonts w:ascii="Times New Roman" w:hAnsi="Times New Roman" w:eastAsia="Times New Roman"/>
+          <w:b/>
+          <w:i w:val="0"/>
+          <w:color w:val="000000"/>
+          <w:sz w:val="26"/>
+        </w:rPr>
+        <w:t>IF - ELSE</w:t>
+      </w:r>
+      <w:r>
+        <w:rPr>
+          <w:rFonts w:ascii="Times New Roman" w:hAnsi="Times New Roman" w:eastAsia="Times New Roman"/>
+          <w:b w:val="0"/>
+          <w:i w:val="0"/>
+          <w:color w:val="000000"/>
+          <w:sz w:val="26"/>
+        </w:rPr>
+        <w:t xml:space="preserve"> mà không bị tê liệt (</w:t>
+      </w:r>
+      <w:r>
+        <w:rPr>
+          <w:rFonts w:ascii="Times New Roman" w:hAnsi="Times New Roman" w:eastAsia="Times New Roman"/>
+          <w:b/>
+          <w:i w:val="0"/>
+          <w:color w:val="000000"/>
+          <w:sz w:val="26"/>
+        </w:rPr>
+        <w:t>Loại bỏ hoàn toàn Single Point of Failure – SPOF</w:t>
+      </w:r>
+      <w:r>
+        <w:rPr>
+          <w:rFonts w:ascii="Times New Roman" w:hAnsi="Times New Roman" w:eastAsia="Times New Roman"/>
+          <w:b w:val="0"/>
+          <w:i w:val="0"/>
+          <w:color w:val="000000"/>
+          <w:sz w:val="26"/>
+        </w:rPr>
+        <w:t>).</w:t>
+      </w:r>
+    </w:p>
+    <w:p>
+      <w:pPr>
+        <w:spacing w:before="160" w:after="80"/>
+      </w:pPr>
+      <w:r>
+        <w:rPr>
+          <w:rFonts w:ascii="Times New Roman" w:hAnsi="Times New Roman" w:eastAsia="Times New Roman"/>
+          <w:b/>
+          <w:i w:val="0"/>
+          <w:color w:val="000000"/>
+          <w:sz w:val="26"/>
+        </w:rPr>
+        <w:t>2.2. Chiến lược Bộ nhớ đệm: In-Memory Cache kết hợp Write-Through (simulator/rule_engine.py &amp; knowledge_rag.py)</w:t>
+      </w:r>
+    </w:p>
+    <w:p>
+      <w:pPr>
+        <w:spacing w:line="312" w:lineRule="auto" w:after="120"/>
+        <w:ind w:firstLine="567"/>
+        <w:jc w:val="both"/>
+      </w:pPr>
+      <w:r>
+        <w:rPr>
+          <w:rFonts w:ascii="Times New Roman" w:hAnsi="Times New Roman" w:eastAsia="Times New Roman"/>
+          <w:b w:val="0"/>
+          <w:i w:val="0"/>
+          <w:color w:val="000000"/>
+          <w:sz w:val="26"/>
+        </w:rPr>
+        <w:t xml:space="preserve">Theo </w:t>
+      </w:r>
+      <w:r>
+        <w:rPr>
+          <w:rFonts w:ascii="Times New Roman" w:hAnsi="Times New Roman" w:eastAsia="Times New Roman"/>
+          <w:b w:val="0"/>
+          <w:i/>
+          <w:color w:val="000000"/>
+          <w:sz w:val="26"/>
+        </w:rPr>
+        <w:t>System Design Primer</w:t>
+      </w:r>
+      <w:r>
+        <w:rPr>
+          <w:rFonts w:ascii="Times New Roman" w:hAnsi="Times New Roman" w:eastAsia="Times New Roman"/>
+          <w:b w:val="0"/>
+          <w:i w:val="0"/>
+          <w:color w:val="000000"/>
+          <w:sz w:val="26"/>
+        </w:rPr>
+        <w:t xml:space="preserve"> (Mục </w:t>
+      </w:r>
+      <w:r>
+        <w:rPr>
+          <w:rFonts w:ascii="Times New Roman" w:hAnsi="Times New Roman" w:eastAsia="Times New Roman"/>
+          <w:b w:val="0"/>
+          <w:i/>
+          <w:color w:val="000000"/>
+          <w:sz w:val="26"/>
+        </w:rPr>
+        <w:t>Cache – Write-through vs Cache-aside</w:t>
+      </w:r>
+      <w:r>
+        <w:rPr>
+          <w:rFonts w:ascii="Times New Roman" w:hAnsi="Times New Roman" w:eastAsia="Times New Roman"/>
+          <w:b w:val="0"/>
+          <w:i w:val="0"/>
+          <w:color w:val="000000"/>
+          <w:sz w:val="26"/>
+        </w:rPr>
+        <w:t>):</w:t>
+      </w:r>
+    </w:p>
+    <w:p>
+      <w:pPr>
+        <w:spacing w:line="312" w:lineRule="auto" w:after="120"/>
+        <w:ind w:left="425"/>
+        <w:jc w:val="both"/>
+      </w:pPr>
+      <w:r>
+        <w:rPr>
+          <w:rFonts w:ascii="Times New Roman" w:hAnsi="Times New Roman" w:eastAsia="Times New Roman"/>
+          <w:b w:val="0"/>
+          <w:i w:val="0"/>
+          <w:color w:val="000000"/>
+          <w:sz w:val="26"/>
+        </w:rPr>
+        <w:t>- Nếu mỗi lần người dùng ra lệnh giọng nói mà Server phải đọc file từ ổ cứng SSD/HDD (\approx 1\text{--}10\text{ ms}) hoặc gọi API tính lại Vector Embedding (\approx 300\text{ ms}) thì tổng độ trễ sẽ rất cao.</w:t>
+      </w:r>
+    </w:p>
+    <w:p>
+      <w:pPr>
+        <w:spacing w:line="312" w:lineRule="auto" w:after="120"/>
+        <w:ind w:left="425"/>
+        <w:jc w:val="both"/>
+      </w:pPr>
+      <w:r>
+        <w:rPr>
+          <w:rFonts w:ascii="Times New Roman" w:hAnsi="Times New Roman" w:eastAsia="Times New Roman"/>
+          <w:b w:val="0"/>
+          <w:i w:val="0"/>
+          <w:color w:val="000000"/>
+          <w:sz w:val="26"/>
+        </w:rPr>
+        <w:t xml:space="preserve">- </w:t>
+      </w:r>
+      <w:r>
+        <w:rPr>
+          <w:rFonts w:ascii="Times New Roman" w:hAnsi="Times New Roman" w:eastAsia="Times New Roman"/>
+          <w:b/>
+          <w:i w:val="0"/>
+          <w:color w:val="000000"/>
+          <w:sz w:val="26"/>
+        </w:rPr>
+        <w:t>Giải pháp đã cài đặt trong dự án:</w:t>
+      </w:r>
+    </w:p>
+    <w:p>
+      <w:pPr>
+        <w:spacing w:line="312" w:lineRule="auto" w:after="120"/>
+        <w:ind w:left="425"/>
+        <w:jc w:val="both"/>
+      </w:pPr>
+      <w:r>
+        <w:rPr>
+          <w:rFonts w:ascii="Times New Roman" w:hAnsi="Times New Roman" w:eastAsia="Times New Roman"/>
+          <w:b w:val="0"/>
+          <w:i w:val="0"/>
+          <w:color w:val="000000"/>
+          <w:sz w:val="26"/>
+        </w:rPr>
+        <w:t xml:space="preserve">1. </w:t>
+      </w:r>
+      <w:r>
+        <w:rPr>
+          <w:rFonts w:ascii="Times New Roman" w:hAnsi="Times New Roman" w:eastAsia="Times New Roman"/>
+          <w:b/>
+          <w:i w:val="0"/>
+          <w:color w:val="000000"/>
+          <w:sz w:val="26"/>
+        </w:rPr>
+        <w:t>Application In-Memory Cache (RAM \approx 100\text{ ns}):</w:t>
+      </w:r>
+      <w:r>
+        <w:rPr>
+          <w:rFonts w:ascii="Times New Roman" w:hAnsi="Times New Roman" w:eastAsia="Times New Roman"/>
+          <w:b w:val="0"/>
+          <w:i w:val="0"/>
+          <w:color w:val="000000"/>
+          <w:sz w:val="26"/>
+        </w:rPr>
+        <w:t xml:space="preserve"> Toàn bộ trạng thái 6 thiết bị (</w:t>
+      </w:r>
+      <w:r>
+        <w:rPr>
+          <w:rFonts w:ascii="Times New Roman" w:hAnsi="Times New Roman" w:eastAsia="Times New Roman"/>
+          <w:b/>
+          <w:i w:val="0"/>
+          <w:color w:val="000000"/>
+          <w:sz w:val="26"/>
+        </w:rPr>
+        <w:t>self.devices</w:t>
+      </w:r>
+      <w:r>
+        <w:rPr>
+          <w:rFonts w:ascii="Times New Roman" w:hAnsi="Times New Roman" w:eastAsia="Times New Roman"/>
+          <w:b w:val="0"/>
+          <w:i w:val="0"/>
+          <w:color w:val="000000"/>
+          <w:sz w:val="26"/>
+        </w:rPr>
+        <w:t>), Bể 1 (</w:t>
+      </w:r>
+      <w:r>
+        <w:rPr>
+          <w:rFonts w:ascii="Times New Roman" w:hAnsi="Times New Roman" w:eastAsia="Times New Roman"/>
+          <w:b/>
+          <w:i w:val="0"/>
+          <w:color w:val="000000"/>
+          <w:sz w:val="26"/>
+        </w:rPr>
+        <w:t>self.active_timers</w:t>
+      </w:r>
+      <w:r>
+        <w:rPr>
+          <w:rFonts w:ascii="Times New Roman" w:hAnsi="Times New Roman" w:eastAsia="Times New Roman"/>
+          <w:b w:val="0"/>
+          <w:i w:val="0"/>
+          <w:color w:val="000000"/>
+          <w:sz w:val="26"/>
+        </w:rPr>
+        <w:t>), Bể 2 (</w:t>
+      </w:r>
+      <w:r>
+        <w:rPr>
+          <w:rFonts w:ascii="Times New Roman" w:hAnsi="Times New Roman" w:eastAsia="Times New Roman"/>
+          <w:b/>
+          <w:i w:val="0"/>
+          <w:color w:val="000000"/>
+          <w:sz w:val="26"/>
+        </w:rPr>
+        <w:t>self.overlay_rules</w:t>
+      </w:r>
+      <w:r>
+        <w:rPr>
+          <w:rFonts w:ascii="Times New Roman" w:hAnsi="Times New Roman" w:eastAsia="Times New Roman"/>
+          <w:b w:val="0"/>
+          <w:i w:val="0"/>
+          <w:color w:val="000000"/>
+          <w:sz w:val="26"/>
+        </w:rPr>
+        <w:t>) và ma trận Vector RAG 3072 chiều (</w:t>
+      </w:r>
+      <w:r>
+        <w:rPr>
+          <w:rFonts w:ascii="Times New Roman" w:hAnsi="Times New Roman" w:eastAsia="Times New Roman"/>
+          <w:b/>
+          <w:i w:val="0"/>
+          <w:color w:val="000000"/>
+          <w:sz w:val="26"/>
+        </w:rPr>
+        <w:t>self.embeddings</w:t>
+      </w:r>
+      <w:r>
+        <w:rPr>
+          <w:rFonts w:ascii="Times New Roman" w:hAnsi="Times New Roman" w:eastAsia="Times New Roman"/>
+          <w:b w:val="0"/>
+          <w:i w:val="0"/>
+          <w:color w:val="000000"/>
+          <w:sz w:val="26"/>
+        </w:rPr>
+        <w:t xml:space="preserve">) đều được nạp sẵn trên RAM. Việc kiểm tra quyền 3 tầng và duyệt đồ thị </w:t>
+      </w:r>
+      <w:r>
+        <w:rPr>
+          <w:rFonts w:ascii="Times New Roman" w:hAnsi="Times New Roman" w:eastAsia="Times New Roman"/>
+          <w:b/>
+          <w:i w:val="0"/>
+          <w:color w:val="000000"/>
+          <w:sz w:val="26"/>
+        </w:rPr>
+        <w:t>DFS Cycle Detection</w:t>
+      </w:r>
+      <w:r>
+        <w:rPr>
+          <w:rFonts w:ascii="Times New Roman" w:hAnsi="Times New Roman" w:eastAsia="Times New Roman"/>
+          <w:b w:val="0"/>
+          <w:i w:val="0"/>
+          <w:color w:val="000000"/>
+          <w:sz w:val="26"/>
+        </w:rPr>
+        <w:t xml:space="preserve"> chỉ mất </w:t>
+      </w:r>
+      <w:r>
+        <w:rPr>
+          <w:rFonts w:ascii="Times New Roman" w:hAnsi="Times New Roman" w:eastAsia="Times New Roman"/>
+          <w:b/>
+          <w:i w:val="0"/>
+          <w:color w:val="000000"/>
+          <w:sz w:val="26"/>
+        </w:rPr>
+        <w:t>&lt; 0.5\text{ ms}</w:t>
+      </w:r>
+      <w:r>
+        <w:rPr>
+          <w:rFonts w:ascii="Times New Roman" w:hAnsi="Times New Roman" w:eastAsia="Times New Roman"/>
+          <w:b w:val="0"/>
+          <w:i w:val="0"/>
+          <w:color w:val="000000"/>
+          <w:sz w:val="26"/>
+        </w:rPr>
+        <w:t>.</w:t>
+      </w:r>
+    </w:p>
+    <w:p>
+      <w:pPr>
+        <w:spacing w:line="312" w:lineRule="auto" w:after="120"/>
+        <w:ind w:left="425"/>
+        <w:jc w:val="both"/>
+      </w:pPr>
+      <w:r>
+        <w:rPr>
+          <w:rFonts w:ascii="Times New Roman" w:hAnsi="Times New Roman" w:eastAsia="Times New Roman"/>
+          <w:b w:val="0"/>
+          <w:i w:val="0"/>
+          <w:color w:val="000000"/>
+          <w:sz w:val="26"/>
+        </w:rPr>
+        <w:t xml:space="preserve">2. </w:t>
+      </w:r>
+      <w:r>
+        <w:rPr>
+          <w:rFonts w:ascii="Times New Roman" w:hAnsi="Times New Roman" w:eastAsia="Times New Roman"/>
+          <w:b/>
+          <w:i w:val="0"/>
+          <w:color w:val="000000"/>
+          <w:sz w:val="26"/>
+        </w:rPr>
+        <w:t>Chiến lược Write-Through Cache:</w:t>
+      </w:r>
+      <w:r>
+        <w:rPr>
+          <w:rFonts w:ascii="Times New Roman" w:hAnsi="Times New Roman" w:eastAsia="Times New Roman"/>
+          <w:b w:val="0"/>
+          <w:i w:val="0"/>
+          <w:color w:val="000000"/>
+          <w:sz w:val="26"/>
+        </w:rPr>
+        <w:t xml:space="preserve"> Ngay khi có lệnh cập nhật luật mới hoặc cấp quyền mới, </w:t>
+      </w:r>
+      <w:r>
+        <w:rPr>
+          <w:rFonts w:ascii="Times New Roman" w:hAnsi="Times New Roman" w:eastAsia="Times New Roman"/>
+          <w:b/>
+          <w:i w:val="0"/>
+          <w:color w:val="000000"/>
+          <w:sz w:val="26"/>
+        </w:rPr>
+        <w:t>SmartHomeEngine</w:t>
+      </w:r>
+      <w:r>
+        <w:rPr>
+          <w:rFonts w:ascii="Times New Roman" w:hAnsi="Times New Roman" w:eastAsia="Times New Roman"/>
+          <w:b w:val="0"/>
+          <w:i w:val="0"/>
+          <w:color w:val="000000"/>
+          <w:sz w:val="26"/>
+        </w:rPr>
+        <w:t xml:space="preserve"> cập nhật ngay trên RAM và </w:t>
+      </w:r>
+      <w:r>
+        <w:rPr>
+          <w:rFonts w:ascii="Times New Roman" w:hAnsi="Times New Roman" w:eastAsia="Times New Roman"/>
+          <w:b/>
+          <w:i w:val="0"/>
+          <w:color w:val="000000"/>
+          <w:sz w:val="26"/>
+        </w:rPr>
+        <w:t>ghi xuyên suốt (Write-Through)</w:t>
+      </w:r>
+      <w:r>
+        <w:rPr>
+          <w:rFonts w:ascii="Times New Roman" w:hAnsi="Times New Roman" w:eastAsia="Times New Roman"/>
+          <w:b w:val="0"/>
+          <w:i w:val="0"/>
+          <w:color w:val="000000"/>
+          <w:sz w:val="26"/>
+        </w:rPr>
+        <w:t xml:space="preserve"> xuống đĩa (</w:t>
+      </w:r>
+      <w:r>
+        <w:rPr>
+          <w:rFonts w:ascii="Times New Roman" w:hAnsi="Times New Roman" w:eastAsia="Times New Roman"/>
+          <w:b/>
+          <w:i w:val="0"/>
+          <w:color w:val="000000"/>
+          <w:sz w:val="26"/>
+        </w:rPr>
+        <w:t>custom_rules_overlay.json</w:t>
+      </w:r>
+      <w:r>
+        <w:rPr>
+          <w:rFonts w:ascii="Times New Roman" w:hAnsi="Times New Roman" w:eastAsia="Times New Roman"/>
+          <w:b w:val="0"/>
+          <w:i w:val="0"/>
+          <w:color w:val="000000"/>
+          <w:sz w:val="26"/>
+        </w:rPr>
+        <w:t xml:space="preserve">, </w:t>
+      </w:r>
+      <w:r>
+        <w:rPr>
+          <w:rFonts w:ascii="Times New Roman" w:hAnsi="Times New Roman" w:eastAsia="Times New Roman"/>
+          <w:b/>
+          <w:i w:val="0"/>
+          <w:color w:val="000000"/>
+          <w:sz w:val="26"/>
+        </w:rPr>
+        <w:t>voiceprints.json</w:t>
+      </w:r>
+      <w:r>
+        <w:rPr>
+          <w:rFonts w:ascii="Times New Roman" w:hAnsi="Times New Roman" w:eastAsia="Times New Roman"/>
+          <w:b w:val="0"/>
+          <w:i w:val="0"/>
+          <w:color w:val="000000"/>
+          <w:sz w:val="26"/>
+        </w:rPr>
+        <w:t xml:space="preserve">, </w:t>
+      </w:r>
+      <w:r>
+        <w:rPr>
+          <w:rFonts w:ascii="Times New Roman" w:hAnsi="Times New Roman" w:eastAsia="Times New Roman"/>
+          <w:b/>
+          <w:i w:val="0"/>
+          <w:color w:val="000000"/>
+          <w:sz w:val="26"/>
+        </w:rPr>
+        <w:t>knowledge_embeddings_cache.json</w:t>
+      </w:r>
+      <w:r>
+        <w:rPr>
+          <w:rFonts w:ascii="Times New Roman" w:hAnsi="Times New Roman" w:eastAsia="Times New Roman"/>
+          <w:b w:val="0"/>
+          <w:i w:val="0"/>
+          <w:color w:val="000000"/>
+          <w:sz w:val="26"/>
+        </w:rPr>
+        <w:t>), đảm bảo dữ liệu luôn bền vững 100% khi tắt nguồn.</w:t>
+      </w:r>
+    </w:p>
+    <w:p>
+      <w:pPr>
+        <w:spacing w:before="160" w:after="80"/>
+      </w:pPr>
+      <w:r>
+        <w:rPr>
+          <w:rFonts w:ascii="Times New Roman" w:hAnsi="Times New Roman" w:eastAsia="Times New Roman"/>
+          <w:b/>
+          <w:i w:val="0"/>
+          <w:color w:val="000000"/>
+          <w:sz w:val="26"/>
+        </w:rPr>
+        <w:t>2.3. Xử lý Bất đồng bộ &amp; Hàng đợi Thông điệp (Asynchronism, Message Queues &amp; Back Pressure)</w:t>
+      </w:r>
+    </w:p>
+    <w:p>
+      <w:pPr>
+        <w:spacing w:line="312" w:lineRule="auto" w:after="120"/>
+        <w:ind w:firstLine="567"/>
+        <w:jc w:val="both"/>
+      </w:pPr>
+      <w:r>
+        <w:rPr>
+          <w:rFonts w:ascii="Times New Roman" w:hAnsi="Times New Roman" w:eastAsia="Times New Roman"/>
+          <w:b w:val="0"/>
+          <w:i w:val="0"/>
+          <w:color w:val="000000"/>
+          <w:sz w:val="26"/>
+        </w:rPr>
+        <w:t xml:space="preserve">Theo </w:t>
+      </w:r>
+      <w:r>
+        <w:rPr>
+          <w:rFonts w:ascii="Times New Roman" w:hAnsi="Times New Roman" w:eastAsia="Times New Roman"/>
+          <w:b w:val="0"/>
+          <w:i/>
+          <w:color w:val="000000"/>
+          <w:sz w:val="26"/>
+        </w:rPr>
+        <w:t>System Design Primer</w:t>
+      </w:r>
+      <w:r>
+        <w:rPr>
+          <w:rFonts w:ascii="Times New Roman" w:hAnsi="Times New Roman" w:eastAsia="Times New Roman"/>
+          <w:b w:val="0"/>
+          <w:i w:val="0"/>
+          <w:color w:val="000000"/>
+          <w:sz w:val="26"/>
+        </w:rPr>
+        <w:t xml:space="preserve"> (Mục </w:t>
+      </w:r>
+      <w:r>
+        <w:rPr>
+          <w:rFonts w:ascii="Times New Roman" w:hAnsi="Times New Roman" w:eastAsia="Times New Roman"/>
+          <w:b w:val="0"/>
+          <w:i/>
+          <w:color w:val="000000"/>
+          <w:sz w:val="26"/>
+        </w:rPr>
+        <w:t>Asynchronism – Message Queues &amp; Task Queues</w:t>
+      </w:r>
+      <w:r>
+        <w:rPr>
+          <w:rFonts w:ascii="Times New Roman" w:hAnsi="Times New Roman" w:eastAsia="Times New Roman"/>
+          <w:b w:val="0"/>
+          <w:i w:val="0"/>
+          <w:color w:val="000000"/>
+          <w:sz w:val="26"/>
+        </w:rPr>
+        <w:t>):</w:t>
+      </w:r>
+    </w:p>
+    <w:p>
+      <w:pPr>
+        <w:spacing w:line="312" w:lineRule="auto" w:after="120"/>
+        <w:ind w:left="425"/>
+        <w:jc w:val="both"/>
+      </w:pPr>
+      <w:r>
+        <w:rPr>
+          <w:rFonts w:ascii="Times New Roman" w:hAnsi="Times New Roman" w:eastAsia="Times New Roman"/>
+          <w:b w:val="0"/>
+          <w:i w:val="0"/>
+          <w:color w:val="000000"/>
+          <w:sz w:val="26"/>
+        </w:rPr>
+        <w:t xml:space="preserve">- </w:t>
+      </w:r>
+      <w:r>
+        <w:rPr>
+          <w:rFonts w:ascii="Times New Roman" w:hAnsi="Times New Roman" w:eastAsia="Times New Roman"/>
+          <w:b/>
+          <w:i w:val="0"/>
+          <w:color w:val="000000"/>
+          <w:sz w:val="26"/>
+        </w:rPr>
+        <w:t>Message Queue (MQTT Pub/Sub):</w:t>
+      </w:r>
+      <w:r>
+        <w:rPr>
+          <w:rFonts w:ascii="Times New Roman" w:hAnsi="Times New Roman" w:eastAsia="Times New Roman"/>
+          <w:b w:val="0"/>
+          <w:i w:val="0"/>
+          <w:color w:val="000000"/>
+          <w:sz w:val="26"/>
+        </w:rPr>
+        <w:t xml:space="preserve"> Tách rời hoàn toàn (</w:t>
+      </w:r>
+      <w:r>
+        <w:rPr>
+          <w:rFonts w:ascii="Times New Roman" w:hAnsi="Times New Roman" w:eastAsia="Times New Roman"/>
+          <w:b/>
+          <w:i w:val="0"/>
+          <w:color w:val="000000"/>
+          <w:sz w:val="26"/>
+        </w:rPr>
+        <w:t>Decoupling</w:t>
+      </w:r>
+      <w:r>
+        <w:rPr>
+          <w:rFonts w:ascii="Times New Roman" w:hAnsi="Times New Roman" w:eastAsia="Times New Roman"/>
+          <w:b w:val="0"/>
+          <w:i w:val="0"/>
+          <w:color w:val="000000"/>
+          <w:sz w:val="26"/>
+        </w:rPr>
+        <w:t>) giữa tầng xử lý AI (</w:t>
+      </w:r>
+      <w:r>
+        <w:rPr>
+          <w:rFonts w:ascii="Times New Roman" w:hAnsi="Times New Roman" w:eastAsia="Times New Roman"/>
+          <w:b/>
+          <w:i w:val="0"/>
+          <w:color w:val="000000"/>
+          <w:sz w:val="26"/>
+        </w:rPr>
+        <w:t>server.py</w:t>
+      </w:r>
+      <w:r>
+        <w:rPr>
+          <w:rFonts w:ascii="Times New Roman" w:hAnsi="Times New Roman" w:eastAsia="Times New Roman"/>
+          <w:b w:val="0"/>
+          <w:i w:val="0"/>
+          <w:color w:val="000000"/>
+          <w:sz w:val="26"/>
+        </w:rPr>
+        <w:t>) và tầng phần cứng (</w:t>
+      </w:r>
+      <w:r>
+        <w:rPr>
+          <w:rFonts w:ascii="Times New Roman" w:hAnsi="Times New Roman" w:eastAsia="Times New Roman"/>
+          <w:b/>
+          <w:i w:val="0"/>
+          <w:color w:val="000000"/>
+          <w:sz w:val="26"/>
+        </w:rPr>
+        <w:t>ESP8266</w:t>
+      </w:r>
+      <w:r>
+        <w:rPr>
+          <w:rFonts w:ascii="Times New Roman" w:hAnsi="Times New Roman" w:eastAsia="Times New Roman"/>
+          <w:b w:val="0"/>
+          <w:i w:val="0"/>
+          <w:color w:val="000000"/>
+          <w:sz w:val="26"/>
+        </w:rPr>
+        <w:t>). Server không bị treo chờ phần cứng phản hồi mà phát hành bản tin bất đồng bộ qua MQTT Broker.</w:t>
+      </w:r>
+    </w:p>
+    <w:p>
+      <w:pPr>
+        <w:spacing w:line="312" w:lineRule="auto" w:after="120"/>
+        <w:ind w:left="425"/>
+        <w:jc w:val="both"/>
+      </w:pPr>
+      <w:r>
+        <w:rPr>
+          <w:rFonts w:ascii="Times New Roman" w:hAnsi="Times New Roman" w:eastAsia="Times New Roman"/>
+          <w:b w:val="0"/>
+          <w:i w:val="0"/>
+          <w:color w:val="000000"/>
+          <w:sz w:val="26"/>
+        </w:rPr>
+        <w:t xml:space="preserve">- </w:t>
+      </w:r>
+      <w:r>
+        <w:rPr>
+          <w:rFonts w:ascii="Times New Roman" w:hAnsi="Times New Roman" w:eastAsia="Times New Roman"/>
+          <w:b/>
+          <w:i w:val="0"/>
+          <w:color w:val="000000"/>
+          <w:sz w:val="26"/>
+        </w:rPr>
+        <w:t>Task Queue (`asyncio` Event Loop):</w:t>
+      </w:r>
+      <w:r>
+        <w:rPr>
+          <w:rFonts w:ascii="Times New Roman" w:hAnsi="Times New Roman" w:eastAsia="Times New Roman"/>
+          <w:b w:val="0"/>
+          <w:i w:val="0"/>
+          <w:color w:val="000000"/>
+          <w:sz w:val="26"/>
+        </w:rPr>
+        <w:t xml:space="preserve"> Các bộ hẹn giờ trong </w:t>
+      </w:r>
+      <w:r>
+        <w:rPr>
+          <w:rFonts w:ascii="Times New Roman" w:hAnsi="Times New Roman" w:eastAsia="Times New Roman"/>
+          <w:b/>
+          <w:i w:val="0"/>
+          <w:color w:val="000000"/>
+          <w:sz w:val="26"/>
+        </w:rPr>
+        <w:t>Bể 1</w:t>
+      </w:r>
+      <w:r>
+        <w:rPr>
+          <w:rFonts w:ascii="Times New Roman" w:hAnsi="Times New Roman" w:eastAsia="Times New Roman"/>
+          <w:b w:val="0"/>
+          <w:i w:val="0"/>
+          <w:color w:val="000000"/>
+          <w:sz w:val="26"/>
+        </w:rPr>
+        <w:t xml:space="preserve"> (</w:t>
+      </w:r>
+      <w:r>
+        <w:rPr>
+          <w:rFonts w:ascii="Times New Roman" w:hAnsi="Times New Roman" w:eastAsia="Times New Roman"/>
+          <w:b/>
+          <w:i w:val="0"/>
+          <w:color w:val="000000"/>
+          <w:sz w:val="26"/>
+        </w:rPr>
+        <w:t>_timer_tasks</w:t>
+      </w:r>
+      <w:r>
+        <w:rPr>
+          <w:rFonts w:ascii="Times New Roman" w:hAnsi="Times New Roman" w:eastAsia="Times New Roman"/>
+          <w:b w:val="0"/>
+          <w:i w:val="0"/>
+          <w:color w:val="000000"/>
+          <w:sz w:val="26"/>
+        </w:rPr>
+        <w:t xml:space="preserve">) và hiệu ứng nháy đèn thu âm </w:t>
+      </w:r>
+      <w:r>
+        <w:rPr>
+          <w:rFonts w:ascii="Times New Roman" w:hAnsi="Times New Roman" w:eastAsia="Times New Roman"/>
+          <w:b/>
+          <w:i w:val="0"/>
+          <w:color w:val="000000"/>
+          <w:sz w:val="26"/>
+        </w:rPr>
+        <w:t>3-2-1</w:t>
+      </w:r>
+      <w:r>
+        <w:rPr>
+          <w:rFonts w:ascii="Times New Roman" w:hAnsi="Times New Roman" w:eastAsia="Times New Roman"/>
+          <w:b w:val="0"/>
+          <w:i w:val="0"/>
+          <w:color w:val="000000"/>
+          <w:sz w:val="26"/>
+        </w:rPr>
+        <w:t xml:space="preserve"> (</w:t>
+      </w:r>
+      <w:r>
+        <w:rPr>
+          <w:rFonts w:ascii="Times New Roman" w:hAnsi="Times New Roman" w:eastAsia="Times New Roman"/>
+          <w:b/>
+          <w:i w:val="0"/>
+          <w:color w:val="000000"/>
+          <w:sz w:val="26"/>
+        </w:rPr>
+        <w:t>blink_signal_light</w:t>
+      </w:r>
+      <w:r>
+        <w:rPr>
+          <w:rFonts w:ascii="Times New Roman" w:hAnsi="Times New Roman" w:eastAsia="Times New Roman"/>
+          <w:b w:val="0"/>
+          <w:i w:val="0"/>
+          <w:color w:val="000000"/>
+          <w:sz w:val="26"/>
+        </w:rPr>
+        <w:t>) chạy trên các Coroutine độc lập, không bao giờ làm nghẽn (</w:t>
+      </w:r>
+      <w:r>
+        <w:rPr>
+          <w:rFonts w:ascii="Times New Roman" w:hAnsi="Times New Roman" w:eastAsia="Times New Roman"/>
+          <w:b/>
+          <w:i w:val="0"/>
+          <w:color w:val="000000"/>
+          <w:sz w:val="26"/>
+        </w:rPr>
+        <w:t>block</w:t>
+      </w:r>
+      <w:r>
+        <w:rPr>
+          <w:rFonts w:ascii="Times New Roman" w:hAnsi="Times New Roman" w:eastAsia="Times New Roman"/>
+          <w:b w:val="0"/>
+          <w:i w:val="0"/>
+          <w:color w:val="000000"/>
+          <w:sz w:val="26"/>
+        </w:rPr>
+        <w:t>) luồng nhận giọng nói.</w:t>
+      </w:r>
+    </w:p>
+    <w:p>
+      <w:pPr>
+        <w:spacing w:line="312" w:lineRule="auto" w:after="120"/>
+        <w:ind w:left="425"/>
+        <w:jc w:val="both"/>
+      </w:pPr>
+      <w:r>
+        <w:rPr>
+          <w:rFonts w:ascii="Times New Roman" w:hAnsi="Times New Roman" w:eastAsia="Times New Roman"/>
+          <w:b w:val="0"/>
+          <w:i w:val="0"/>
+          <w:color w:val="000000"/>
+          <w:sz w:val="26"/>
+        </w:rPr>
+        <w:t xml:space="preserve">- </w:t>
+      </w:r>
+      <w:r>
+        <w:rPr>
+          <w:rFonts w:ascii="Times New Roman" w:hAnsi="Times New Roman" w:eastAsia="Times New Roman"/>
+          <w:b/>
+          <w:i w:val="0"/>
+          <w:color w:val="000000"/>
+          <w:sz w:val="26"/>
+        </w:rPr>
+        <w:t>Chống quá tải (Back Pressure &amp; Rate Limiting):</w:t>
+      </w:r>
+      <w:r>
+        <w:rPr>
+          <w:rFonts w:ascii="Times New Roman" w:hAnsi="Times New Roman" w:eastAsia="Times New Roman"/>
+          <w:b w:val="0"/>
+          <w:i w:val="0"/>
+          <w:color w:val="000000"/>
+          <w:sz w:val="26"/>
+        </w:rPr>
+        <w:t xml:space="preserve"> Cơ chế </w:t>
+      </w:r>
+      <w:r>
+        <w:rPr>
+          <w:rFonts w:ascii="Times New Roman" w:hAnsi="Times New Roman" w:eastAsia="Times New Roman"/>
+          <w:b/>
+          <w:i w:val="0"/>
+          <w:color w:val="000000"/>
+          <w:sz w:val="26"/>
+        </w:rPr>
+        <w:t>2-Strike Silent Ignore</w:t>
+      </w:r>
+      <w:r>
+        <w:rPr>
+          <w:rFonts w:ascii="Times New Roman" w:hAnsi="Times New Roman" w:eastAsia="Times New Roman"/>
+          <w:b w:val="0"/>
+          <w:i w:val="0"/>
+          <w:color w:val="000000"/>
+          <w:sz w:val="26"/>
+        </w:rPr>
+        <w:t xml:space="preserve"> trong </w:t>
+      </w:r>
+      <w:r>
+        <w:rPr>
+          <w:rFonts w:ascii="Times New Roman" w:hAnsi="Times New Roman" w:eastAsia="Times New Roman"/>
+          <w:b/>
+          <w:i w:val="0"/>
+          <w:color w:val="000000"/>
+          <w:sz w:val="26"/>
+        </w:rPr>
+        <w:t>voice_auth.py</w:t>
+      </w:r>
+      <w:r>
+        <w:rPr>
+          <w:rFonts w:ascii="Times New Roman" w:hAnsi="Times New Roman" w:eastAsia="Times New Roman"/>
+          <w:b w:val="0"/>
+          <w:i w:val="0"/>
+          <w:color w:val="000000"/>
+          <w:sz w:val="26"/>
+        </w:rPr>
+        <w:t xml:space="preserve"> chính là một bộ </w:t>
+      </w:r>
+      <w:r>
+        <w:rPr>
+          <w:rFonts w:ascii="Times New Roman" w:hAnsi="Times New Roman" w:eastAsia="Times New Roman"/>
+          <w:b/>
+          <w:i w:val="0"/>
+          <w:color w:val="000000"/>
+          <w:sz w:val="26"/>
+        </w:rPr>
+        <w:t>Rate Limiter / Circuit Breaker</w:t>
+      </w:r>
+      <w:r>
+        <w:rPr>
+          <w:rFonts w:ascii="Times New Roman" w:hAnsi="Times New Roman" w:eastAsia="Times New Roman"/>
+          <w:b w:val="0"/>
+          <w:i w:val="0"/>
+          <w:color w:val="000000"/>
+          <w:sz w:val="26"/>
+        </w:rPr>
+        <w:t xml:space="preserve"> ở tầng sinh trắc học: Khi phát hiện giọng người lạ cố tình spam lệnh quá 2 lần, hệ thống ngắt phản hồi âm thanh từ lần thứ 3 (</w:t>
+      </w:r>
+      <w:r>
+        <w:rPr>
+          <w:rFonts w:ascii="Times New Roman" w:hAnsi="Times New Roman" w:eastAsia="Times New Roman"/>
+          <w:b/>
+          <w:i w:val="0"/>
+          <w:color w:val="000000"/>
+          <w:sz w:val="26"/>
+        </w:rPr>
+        <w:t>silent_ignore = True</w:t>
+      </w:r>
+      <w:r>
+        <w:rPr>
+          <w:rFonts w:ascii="Times New Roman" w:hAnsi="Times New Roman" w:eastAsia="Times New Roman"/>
+          <w:b w:val="0"/>
+          <w:i w:val="0"/>
+          <w:color w:val="000000"/>
+          <w:sz w:val="26"/>
+        </w:rPr>
+        <w:t>), bảo vệ tài nguyên xử lý AI và loa thông báo.</w:t>
+      </w:r>
+    </w:p>
+    <w:p>
+      <w:pPr>
+        <w:spacing w:before="160" w:after="80"/>
+      </w:pPr>
+      <w:r>
+        <w:rPr>
+          <w:rFonts w:ascii="Times New Roman" w:hAnsi="Times New Roman" w:eastAsia="Times New Roman"/>
+          <w:b/>
+          <w:i w:val="0"/>
+          <w:color w:val="000000"/>
+          <w:sz w:val="26"/>
+        </w:rPr>
+        <w:t>2.4. Phối hợp Đa giao thức Truyền thông (HTTP REST vs WebSocket vs MQTT)</w:t>
+      </w:r>
+    </w:p>
+    <w:p>
+      <w:pPr>
+        <w:spacing w:line="312" w:lineRule="auto" w:after="120"/>
+        <w:ind w:firstLine="567"/>
+        <w:jc w:val="both"/>
+      </w:pPr>
+      <w:r>
+        <w:rPr>
+          <w:rFonts w:ascii="Times New Roman" w:hAnsi="Times New Roman" w:eastAsia="Times New Roman"/>
+          <w:b w:val="0"/>
+          <w:i w:val="0"/>
+          <w:color w:val="000000"/>
+          <w:sz w:val="26"/>
+        </w:rPr>
+        <w:t xml:space="preserve">Đúng theo bảng so sánh giao thức trong </w:t>
+      </w:r>
+      <w:r>
+        <w:rPr>
+          <w:rFonts w:ascii="Times New Roman" w:hAnsi="Times New Roman" w:eastAsia="Times New Roman"/>
+          <w:b w:val="0"/>
+          <w:i/>
+          <w:color w:val="000000"/>
+          <w:sz w:val="26"/>
+        </w:rPr>
+        <w:t>System Design Primer</w:t>
+      </w:r>
+      <w:r>
+        <w:rPr>
+          <w:rFonts w:ascii="Times New Roman" w:hAnsi="Times New Roman" w:eastAsia="Times New Roman"/>
+          <w:b w:val="0"/>
+          <w:i w:val="0"/>
+          <w:color w:val="000000"/>
+          <w:sz w:val="26"/>
+        </w:rPr>
+        <w:t xml:space="preserve"> (Mục </w:t>
+      </w:r>
+      <w:r>
+        <w:rPr>
+          <w:rFonts w:ascii="Times New Roman" w:hAnsi="Times New Roman" w:eastAsia="Times New Roman"/>
+          <w:b w:val="0"/>
+          <w:i/>
+          <w:color w:val="000000"/>
+          <w:sz w:val="26"/>
+        </w:rPr>
+        <w:t>Communication</w:t>
+      </w:r>
+      <w:r>
+        <w:rPr>
+          <w:rFonts w:ascii="Times New Roman" w:hAnsi="Times New Roman" w:eastAsia="Times New Roman"/>
+          <w:b w:val="0"/>
+          <w:i w:val="0"/>
+          <w:color w:val="000000"/>
+          <w:sz w:val="26"/>
+        </w:rPr>
+        <w:t>):</w:t>
+      </w:r>
+    </w:p>
+    <w:tbl>
+      <w:tblPr>
+        <w:tblStyle w:val="TableGrid"/>
+        <w:tblW w:type="auto" w:w="0"/>
+        <w:jc w:val="center"/>
+        <w:tblLook w:firstColumn="1" w:firstRow="1" w:lastColumn="0" w:lastRow="0" w:noHBand="0" w:noVBand="1" w:val="04A0"/>
+      </w:tblPr>
+      <w:tblGrid>
+        <w:gridCol w:w="2268"/>
+        <w:gridCol w:w="2268"/>
+        <w:gridCol w:w="2268"/>
+        <w:gridCol w:w="2268"/>
+      </w:tblGrid>
+      <w:tr>
+        <w:tc>
+          <w:tcPr>
+            <w:tcW w:type="dxa" w:w="2268"/>
+          </w:tcPr>
+          <w:p>
+            <w:pPr>
+              <w:spacing w:after="60" w:line="276" w:lineRule="auto"/>
+              <w:jc w:val="center"/>
+            </w:pPr>
+            <w:r/>
+            <w:r>
+              <w:rPr>
+                <w:rFonts w:ascii="Times New Roman" w:hAnsi="Times New Roman" w:eastAsia="Times New Roman"/>
+                <w:b/>
+                <w:i w:val="0"/>
+                <w:color w:val="000000"/>
+                <w:sz w:val="23"/>
+              </w:rPr>
+              <w:t>Giao thức trong Đồ án</w:t>
+            </w:r>
+          </w:p>
+        </w:tc>
+        <w:tc>
+          <w:tcPr>
+            <w:tcW w:type="dxa" w:w="2268"/>
+          </w:tcPr>
+          <w:p>
+            <w:pPr>
+              <w:spacing w:after="60" w:line="276" w:lineRule="auto"/>
+              <w:jc w:val="center"/>
+            </w:pPr>
+            <w:r/>
+            <w:r>
+              <w:rPr>
+                <w:rFonts w:ascii="Times New Roman" w:hAnsi="Times New Roman" w:eastAsia="Times New Roman"/>
+                <w:b/>
+                <w:i w:val="0"/>
+                <w:color w:val="000000"/>
+                <w:sz w:val="23"/>
+              </w:rPr>
+              <w:t>Tầng vận chuyển</w:t>
+            </w:r>
+          </w:p>
+        </w:tc>
+        <w:tc>
+          <w:tcPr>
+            <w:tcW w:type="dxa" w:w="2268"/>
+          </w:tcPr>
+          <w:p>
+            <w:pPr>
+              <w:spacing w:after="60" w:line="276" w:lineRule="auto"/>
+              <w:jc w:val="center"/>
+            </w:pPr>
+            <w:r/>
+            <w:r>
+              <w:rPr>
+                <w:rFonts w:ascii="Times New Roman" w:hAnsi="Times New Roman" w:eastAsia="Times New Roman"/>
+                <w:b/>
+                <w:i w:val="0"/>
+                <w:color w:val="000000"/>
+                <w:sz w:val="23"/>
+              </w:rPr>
+              <w:t>Đặc tính kỹ thuật</w:t>
+            </w:r>
+          </w:p>
+        </w:tc>
+        <w:tc>
+          <w:tcPr>
+            <w:tcW w:type="dxa" w:w="2268"/>
+          </w:tcPr>
+          <w:p>
+            <w:pPr>
+              <w:spacing w:after="60" w:line="276" w:lineRule="auto"/>
+              <w:jc w:val="center"/>
+            </w:pPr>
+            <w:r/>
+            <w:r>
+              <w:rPr>
+                <w:rFonts w:ascii="Times New Roman" w:hAnsi="Times New Roman" w:eastAsia="Times New Roman"/>
+                <w:b/>
+                <w:i w:val="0"/>
+                <w:color w:val="000000"/>
+                <w:sz w:val="23"/>
+              </w:rPr>
+              <w:t>Lý do lựa chọn theo System Design Primer</w:t>
+            </w:r>
+          </w:p>
+        </w:tc>
+      </w:tr>
+      <w:tr>
+        <w:tc>
+          <w:tcPr>
+            <w:tcW w:type="dxa" w:w="2268"/>
+          </w:tcPr>
+          <w:p>
+            <w:pPr>
+              <w:spacing w:after="60" w:line="276" w:lineRule="auto"/>
+            </w:pPr>
+            <w:r/>
+            <w:r>
+              <w:rPr>
+                <w:rFonts w:ascii="Times New Roman" w:hAnsi="Times New Roman" w:eastAsia="Times New Roman"/>
+                <w:b/>
+                <w:i w:val="0"/>
+                <w:color w:val="000000"/>
+                <w:sz w:val="23"/>
+              </w:rPr>
+              <w:t>1. HTTP REST (`/api/state`, `/api/voice_samples`)</w:t>
+            </w:r>
+          </w:p>
+        </w:tc>
+        <w:tc>
+          <w:tcPr>
+            <w:tcW w:type="dxa" w:w="2268"/>
+          </w:tcPr>
+          <w:p>
+            <w:pPr>
+              <w:spacing w:after="60" w:line="276" w:lineRule="auto"/>
+            </w:pPr>
+            <w:r/>
+            <w:r>
+              <w:rPr>
+                <w:rFonts w:ascii="Times New Roman" w:hAnsi="Times New Roman" w:eastAsia="Times New Roman"/>
+                <w:b w:val="0"/>
+                <w:i w:val="0"/>
+                <w:color w:val="000000"/>
+                <w:sz w:val="23"/>
+              </w:rPr>
+              <w:t>TCP</w:t>
+            </w:r>
+          </w:p>
+        </w:tc>
+        <w:tc>
+          <w:tcPr>
+            <w:tcW w:type="dxa" w:w="2268"/>
+          </w:tcPr>
+          <w:p>
+            <w:pPr>
+              <w:spacing w:after="60" w:line="276" w:lineRule="auto"/>
+            </w:pPr>
+            <w:r/>
+            <w:r>
+              <w:rPr>
+                <w:rFonts w:ascii="Times New Roman" w:hAnsi="Times New Roman" w:eastAsia="Times New Roman"/>
+                <w:b w:val="0"/>
+                <w:i w:val="0"/>
+                <w:color w:val="000000"/>
+                <w:sz w:val="23"/>
+              </w:rPr>
+              <w:t>Stateless, Request-Response, Cacheable</w:t>
+            </w:r>
+          </w:p>
+        </w:tc>
+        <w:tc>
+          <w:tcPr>
+            <w:tcW w:type="dxa" w:w="2268"/>
+          </w:tcPr>
+          <w:p>
+            <w:pPr>
+              <w:spacing w:after="60" w:line="276" w:lineRule="auto"/>
+            </w:pPr>
+            <w:r/>
+            <w:r>
+              <w:rPr>
+                <w:rFonts w:ascii="Times New Roman" w:hAnsi="Times New Roman" w:eastAsia="Times New Roman"/>
+                <w:b w:val="0"/>
+                <w:i w:val="0"/>
+                <w:color w:val="000000"/>
+                <w:sz w:val="23"/>
+              </w:rPr>
+              <w:t>Dùng khi trình duyệt/App mới mở trang lần đầu để lấy danh sách mẫu âm thanh và cấu hình khởi tạo.</w:t>
+            </w:r>
+          </w:p>
+        </w:tc>
+      </w:tr>
+      <w:tr>
+        <w:tc>
+          <w:tcPr>
+            <w:tcW w:type="dxa" w:w="2268"/>
+          </w:tcPr>
+          <w:p>
+            <w:pPr>
+              <w:spacing w:after="60" w:line="276" w:lineRule="auto"/>
+            </w:pPr>
+            <w:r/>
+            <w:r>
+              <w:rPr>
+                <w:rFonts w:ascii="Times New Roman" w:hAnsi="Times New Roman" w:eastAsia="Times New Roman"/>
+                <w:b/>
+                <w:i w:val="0"/>
+                <w:color w:val="000000"/>
+                <w:sz w:val="23"/>
+              </w:rPr>
+              <w:t>2. WebSocket (`/ws`)</w:t>
+            </w:r>
+          </w:p>
+        </w:tc>
+        <w:tc>
+          <w:tcPr>
+            <w:tcW w:type="dxa" w:w="2268"/>
+          </w:tcPr>
+          <w:p>
+            <w:pPr>
+              <w:spacing w:after="60" w:line="276" w:lineRule="auto"/>
+            </w:pPr>
+            <w:r/>
+            <w:r>
+              <w:rPr>
+                <w:rFonts w:ascii="Times New Roman" w:hAnsi="Times New Roman" w:eastAsia="Times New Roman"/>
+                <w:b w:val="0"/>
+                <w:i w:val="0"/>
+                <w:color w:val="000000"/>
+                <w:sz w:val="23"/>
+              </w:rPr>
+              <w:t>TCP</w:t>
+            </w:r>
+          </w:p>
+        </w:tc>
+        <w:tc>
+          <w:tcPr>
+            <w:tcW w:type="dxa" w:w="2268"/>
+          </w:tcPr>
+          <w:p>
+            <w:pPr>
+              <w:spacing w:after="60" w:line="276" w:lineRule="auto"/>
+            </w:pPr>
+            <w:r/>
+            <w:r>
+              <w:rPr>
+                <w:rFonts w:ascii="Times New Roman" w:hAnsi="Times New Roman" w:eastAsia="Times New Roman"/>
+                <w:b w:val="0"/>
+                <w:i w:val="0"/>
+                <w:color w:val="000000"/>
+                <w:sz w:val="23"/>
+              </w:rPr>
+              <w:t>Full-Duplex (Song công toàn phần), Kết nối giữ sống (Persistent)</w:t>
+            </w:r>
+          </w:p>
+        </w:tc>
+        <w:tc>
+          <w:tcPr>
+            <w:tcW w:type="dxa" w:w="2268"/>
+          </w:tcPr>
+          <w:p>
+            <w:pPr>
+              <w:spacing w:after="60" w:line="276" w:lineRule="auto"/>
+            </w:pPr>
+            <w:r/>
+            <w:r>
+              <w:rPr>
+                <w:rFonts w:ascii="Times New Roman" w:hAnsi="Times New Roman" w:eastAsia="Times New Roman"/>
+                <w:b w:val="0"/>
+                <w:i w:val="0"/>
+                <w:color w:val="000000"/>
+                <w:sz w:val="23"/>
+              </w:rPr>
+              <w:t>Truyền luồng âm thanh PCM 16kHz thời gian thực và đẩy sự kiện cập nhật mô hình Nhà 3D tức thì không tốn header HTTP thừa.</w:t>
+            </w:r>
+          </w:p>
+        </w:tc>
+      </w:tr>
+      <w:tr>
+        <w:tc>
+          <w:tcPr>
+            <w:tcW w:type="dxa" w:w="2268"/>
+          </w:tcPr>
+          <w:p>
+            <w:pPr>
+              <w:spacing w:after="60" w:line="276" w:lineRule="auto"/>
+            </w:pPr>
+            <w:r/>
+            <w:r>
+              <w:rPr>
+                <w:rFonts w:ascii="Times New Roman" w:hAnsi="Times New Roman" w:eastAsia="Times New Roman"/>
+                <w:b/>
+                <w:i w:val="0"/>
+                <w:color w:val="000000"/>
+                <w:sz w:val="23"/>
+              </w:rPr>
+              <w:t>3. MQTT (`smarthome/#`)</w:t>
+            </w:r>
+          </w:p>
+        </w:tc>
+        <w:tc>
+          <w:tcPr>
+            <w:tcW w:type="dxa" w:w="2268"/>
+          </w:tcPr>
+          <w:p>
+            <w:pPr>
+              <w:spacing w:after="60" w:line="276" w:lineRule="auto"/>
+            </w:pPr>
+            <w:r/>
+            <w:r>
+              <w:rPr>
+                <w:rFonts w:ascii="Times New Roman" w:hAnsi="Times New Roman" w:eastAsia="Times New Roman"/>
+                <w:b w:val="0"/>
+                <w:i w:val="0"/>
+                <w:color w:val="000000"/>
+                <w:sz w:val="23"/>
+              </w:rPr>
+              <w:t>TCP</w:t>
+            </w:r>
+          </w:p>
+        </w:tc>
+        <w:tc>
+          <w:tcPr>
+            <w:tcW w:type="dxa" w:w="2268"/>
+          </w:tcPr>
+          <w:p>
+            <w:pPr>
+              <w:spacing w:after="60" w:line="276" w:lineRule="auto"/>
+            </w:pPr>
+            <w:r/>
+            <w:r>
+              <w:rPr>
+                <w:rFonts w:ascii="Times New Roman" w:hAnsi="Times New Roman" w:eastAsia="Times New Roman"/>
+                <w:b w:val="0"/>
+                <w:i w:val="0"/>
+                <w:color w:val="000000"/>
+                <w:sz w:val="23"/>
+              </w:rPr>
+              <w:t xml:space="preserve">Publish/Subscribe, Header tối giản chỉ </w:t>
+            </w:r>
+            <w:r>
+              <w:rPr>
+                <w:rFonts w:ascii="Times New Roman" w:hAnsi="Times New Roman" w:eastAsia="Times New Roman"/>
+                <w:b/>
+                <w:i w:val="0"/>
+                <w:color w:val="000000"/>
+                <w:sz w:val="23"/>
+              </w:rPr>
+              <w:t>2 bytes</w:t>
+            </w:r>
+            <w:r>
+              <w:rPr>
+                <w:rFonts w:ascii="Times New Roman" w:hAnsi="Times New Roman" w:eastAsia="Times New Roman"/>
+                <w:b w:val="0"/>
+                <w:i w:val="0"/>
+                <w:color w:val="000000"/>
+                <w:sz w:val="23"/>
+              </w:rPr>
+              <w:t xml:space="preserve">, có </w:t>
+            </w:r>
+            <w:r>
+              <w:rPr>
+                <w:rFonts w:ascii="Times New Roman" w:hAnsi="Times New Roman" w:eastAsia="Times New Roman"/>
+                <w:b/>
+                <w:i w:val="0"/>
+                <w:color w:val="000000"/>
+                <w:sz w:val="23"/>
+              </w:rPr>
+              <w:t>QoS 0/1</w:t>
+            </w:r>
+            <w:r>
+              <w:rPr>
+                <w:rFonts w:ascii="Times New Roman" w:hAnsi="Times New Roman" w:eastAsia="Times New Roman"/>
+                <w:b w:val="0"/>
+                <w:i w:val="0"/>
+                <w:color w:val="000000"/>
+                <w:sz w:val="23"/>
+              </w:rPr>
+              <w:t xml:space="preserve"> &amp; </w:t>
+            </w:r>
+            <w:r>
+              <w:rPr>
+                <w:rFonts w:ascii="Times New Roman" w:hAnsi="Times New Roman" w:eastAsia="Times New Roman"/>
+                <w:b/>
+                <w:i w:val="0"/>
+                <w:color w:val="000000"/>
+                <w:sz w:val="23"/>
+              </w:rPr>
+              <w:t>LWT</w:t>
+            </w:r>
+          </w:p>
+        </w:tc>
+        <w:tc>
+          <w:tcPr>
+            <w:tcW w:type="dxa" w:w="2268"/>
+          </w:tcPr>
+          <w:p>
+            <w:pPr>
+              <w:spacing w:after="60" w:line="276" w:lineRule="auto"/>
+            </w:pPr>
+            <w:r/>
+            <w:r>
+              <w:rPr>
+                <w:rFonts w:ascii="Times New Roman" w:hAnsi="Times New Roman" w:eastAsia="Times New Roman"/>
+                <w:b w:val="0"/>
+                <w:i w:val="0"/>
+                <w:color w:val="000000"/>
+                <w:sz w:val="23"/>
+              </w:rPr>
+              <w:t xml:space="preserve">Tối ưu tuyệt đối cho vi điều khiển nhúng RAM nhỏ như </w:t>
+            </w:r>
+            <w:r>
+              <w:rPr>
+                <w:rFonts w:ascii="Times New Roman" w:hAnsi="Times New Roman" w:eastAsia="Times New Roman"/>
+                <w:b/>
+                <w:i w:val="0"/>
+                <w:color w:val="000000"/>
+                <w:sz w:val="23"/>
+              </w:rPr>
+              <w:t>NodeMCU ESP8266</w:t>
+            </w:r>
+            <w:r>
+              <w:rPr>
+                <w:rFonts w:ascii="Times New Roman" w:hAnsi="Times New Roman" w:eastAsia="Times New Roman"/>
+                <w:b w:val="0"/>
+                <w:i w:val="0"/>
+                <w:color w:val="000000"/>
+                <w:sz w:val="23"/>
+              </w:rPr>
+              <w:t xml:space="preserve"> hoạt động qua mạng không dây Wi-Fi.</w:t>
+            </w:r>
+          </w:p>
+        </w:tc>
+      </w:tr>
+    </w:tbl>
+    <w:p>
+      <w:pPr>
+        <w:spacing w:after="120"/>
+      </w:pPr>
+    </w:p>
+    <w:p>
+      <w:pPr>
+        <w:spacing w:before="160" w:after="80"/>
+      </w:pPr>
+      <w:r>
+        <w:rPr>
+          <w:rFonts w:ascii="Times New Roman" w:hAnsi="Times New Roman" w:eastAsia="Times New Roman"/>
+          <w:b/>
+          <w:i w:val="0"/>
+          <w:color w:val="000000"/>
+          <w:sz w:val="26"/>
+        </w:rPr>
+        <w:t>2.5. Bảo mật theo Nguyên tắc Đặc quyền Tối thiểu (Security – Principle of Least Privilege)</w:t>
+      </w:r>
+    </w:p>
+    <w:p>
+      <w:pPr>
+        <w:spacing w:line="312" w:lineRule="auto" w:after="120"/>
+        <w:ind w:firstLine="567"/>
+        <w:jc w:val="both"/>
+      </w:pPr>
+      <w:r>
+        <w:rPr>
+          <w:rFonts w:ascii="Times New Roman" w:hAnsi="Times New Roman" w:eastAsia="Times New Roman"/>
+          <w:b w:val="0"/>
+          <w:i w:val="0"/>
+          <w:color w:val="000000"/>
+          <w:sz w:val="26"/>
+        </w:rPr>
+        <w:t xml:space="preserve">Trong </w:t>
+      </w:r>
+      <w:r>
+        <w:rPr>
+          <w:rFonts w:ascii="Times New Roman" w:hAnsi="Times New Roman" w:eastAsia="Times New Roman"/>
+          <w:b w:val="0"/>
+          <w:i/>
+          <w:color w:val="000000"/>
+          <w:sz w:val="26"/>
+        </w:rPr>
+        <w:t>System Design Primer</w:t>
+      </w:r>
+      <w:r>
+        <w:rPr>
+          <w:rFonts w:ascii="Times New Roman" w:hAnsi="Times New Roman" w:eastAsia="Times New Roman"/>
+          <w:b w:val="0"/>
+          <w:i w:val="0"/>
+          <w:color w:val="000000"/>
+          <w:sz w:val="26"/>
+        </w:rPr>
+        <w:t xml:space="preserve"> (Mục </w:t>
+      </w:r>
+      <w:r>
+        <w:rPr>
+          <w:rFonts w:ascii="Times New Roman" w:hAnsi="Times New Roman" w:eastAsia="Times New Roman"/>
+          <w:b w:val="0"/>
+          <w:i/>
+          <w:color w:val="000000"/>
+          <w:sz w:val="26"/>
+        </w:rPr>
+        <w:t>Security</w:t>
+      </w:r>
+      <w:r>
+        <w:rPr>
+          <w:rFonts w:ascii="Times New Roman" w:hAnsi="Times New Roman" w:eastAsia="Times New Roman"/>
+          <w:b w:val="0"/>
+          <w:i w:val="0"/>
+          <w:color w:val="000000"/>
+          <w:sz w:val="26"/>
+        </w:rPr>
+        <w:t xml:space="preserve">), nguyên tắc quan trọng nhất là </w:t>
+      </w:r>
+      <w:r>
+        <w:rPr>
+          <w:rFonts w:ascii="Times New Roman" w:hAnsi="Times New Roman" w:eastAsia="Times New Roman"/>
+          <w:b/>
+          <w:i w:val="0"/>
+          <w:color w:val="000000"/>
+          <w:sz w:val="26"/>
+        </w:rPr>
+        <w:t>Principle of Least Privilege</w:t>
+      </w:r>
+      <w:r>
+        <w:rPr>
+          <w:rFonts w:ascii="Times New Roman" w:hAnsi="Times New Roman" w:eastAsia="Times New Roman"/>
+          <w:b w:val="0"/>
+          <w:i w:val="0"/>
+          <w:color w:val="000000"/>
+          <w:sz w:val="26"/>
+        </w:rPr>
+        <w:t xml:space="preserve"> (Mỗi tác nhân chỉ được cấp đúng quyền tối thiểu cần thiết để thực hiện nhiệm vụ):</w:t>
+      </w:r>
+    </w:p>
+    <w:p>
+      <w:pPr>
+        <w:spacing w:line="312" w:lineRule="auto" w:after="120"/>
+        <w:ind w:left="425"/>
+        <w:jc w:val="both"/>
+      </w:pPr>
+      <w:r>
+        <w:rPr>
+          <w:rFonts w:ascii="Times New Roman" w:hAnsi="Times New Roman" w:eastAsia="Times New Roman"/>
+          <w:b w:val="0"/>
+          <w:i w:val="0"/>
+          <w:color w:val="000000"/>
+          <w:sz w:val="26"/>
+        </w:rPr>
+        <w:t xml:space="preserve">- </w:t>
+      </w:r>
+      <w:r>
+        <w:rPr>
+          <w:rFonts w:ascii="Times New Roman" w:hAnsi="Times New Roman" w:eastAsia="Times New Roman"/>
+          <w:b/>
+          <w:i w:val="0"/>
+          <w:color w:val="000000"/>
+          <w:sz w:val="26"/>
+        </w:rPr>
+        <w:t>Tầng 3 (Khách):</w:t>
+      </w:r>
+      <w:r>
+        <w:rPr>
+          <w:rFonts w:ascii="Times New Roman" w:hAnsi="Times New Roman" w:eastAsia="Times New Roman"/>
+          <w:b w:val="0"/>
+          <w:i w:val="0"/>
+          <w:color w:val="000000"/>
+          <w:sz w:val="26"/>
+        </w:rPr>
+        <w:t xml:space="preserve"> Chỉ có quyền gọi lệnh đóng/mở cố định, bị cô lập hoàn toàn khỏi Bể 1 (Hẹn giờ), Bể 2 (Luật động) và thông tin riêng tư trong RAG.</w:t>
+      </w:r>
+    </w:p>
+    <w:p>
+      <w:pPr>
+        <w:spacing w:line="312" w:lineRule="auto" w:after="120"/>
+        <w:ind w:left="425"/>
+        <w:jc w:val="both"/>
+      </w:pPr>
+      <w:r>
+        <w:rPr>
+          <w:rFonts w:ascii="Times New Roman" w:hAnsi="Times New Roman" w:eastAsia="Times New Roman"/>
+          <w:b w:val="0"/>
+          <w:i w:val="0"/>
+          <w:color w:val="000000"/>
+          <w:sz w:val="26"/>
+        </w:rPr>
+        <w:t xml:space="preserve">- </w:t>
+      </w:r>
+      <w:r>
+        <w:rPr>
+          <w:rFonts w:ascii="Times New Roman" w:hAnsi="Times New Roman" w:eastAsia="Times New Roman"/>
+          <w:b/>
+          <w:i w:val="0"/>
+          <w:color w:val="000000"/>
+          <w:sz w:val="26"/>
+        </w:rPr>
+        <w:t>Tầng 2 (Thành viên gia đình):</w:t>
+      </w:r>
+      <w:r>
+        <w:rPr>
+          <w:rFonts w:ascii="Times New Roman" w:hAnsi="Times New Roman" w:eastAsia="Times New Roman"/>
+          <w:b w:val="0"/>
+          <w:i w:val="0"/>
+          <w:color w:val="000000"/>
+          <w:sz w:val="26"/>
+        </w:rPr>
+        <w:t xml:space="preserve"> Được cấp không gian tên riêng (</w:t>
+      </w:r>
+      <w:r>
+        <w:rPr>
+          <w:rFonts w:ascii="Times New Roman" w:hAnsi="Times New Roman" w:eastAsia="Times New Roman"/>
+          <w:b/>
+          <w:i w:val="0"/>
+          <w:color w:val="000000"/>
+          <w:sz w:val="26"/>
+        </w:rPr>
+        <w:t>Namespace Isolation / Sharding theo `user_id` trong `user_pools`</w:t>
+      </w:r>
+      <w:r>
+        <w:rPr>
+          <w:rFonts w:ascii="Times New Roman" w:hAnsi="Times New Roman" w:eastAsia="Times New Roman"/>
+          <w:b w:val="0"/>
+          <w:i w:val="0"/>
+          <w:color w:val="000000"/>
+          <w:sz w:val="26"/>
+        </w:rPr>
+        <w:t>), chỉ sửa/xóa được lịch hẹn và bể lệnh của chính mình, không thể xâm phạm lịch hẹn hay quyền của Tầng 1.</w:t>
+      </w:r>
+    </w:p>
+    <w:p>
+      <w:pPr>
+        <w:spacing w:line="312" w:lineRule="auto" w:after="120"/>
+        <w:ind w:left="425"/>
+        <w:jc w:val="both"/>
+      </w:pPr>
+      <w:r>
+        <w:rPr>
+          <w:rFonts w:ascii="Times New Roman" w:hAnsi="Times New Roman" w:eastAsia="Times New Roman"/>
+          <w:b w:val="0"/>
+          <w:i w:val="0"/>
+          <w:color w:val="000000"/>
+          <w:sz w:val="26"/>
+        </w:rPr>
+        <w:t xml:space="preserve">- </w:t>
+      </w:r>
+      <w:r>
+        <w:rPr>
+          <w:rFonts w:ascii="Times New Roman" w:hAnsi="Times New Roman" w:eastAsia="Times New Roman"/>
+          <w:b/>
+          <w:i w:val="0"/>
+          <w:color w:val="000000"/>
+          <w:sz w:val="26"/>
+        </w:rPr>
+        <w:t>Tầng 1 (Admin – Nguyễn Tuấn Anh):</w:t>
+      </w:r>
+      <w:r>
+        <w:rPr>
+          <w:rFonts w:ascii="Times New Roman" w:hAnsi="Times New Roman" w:eastAsia="Times New Roman"/>
+          <w:b w:val="0"/>
+          <w:i w:val="0"/>
+          <w:color w:val="000000"/>
+          <w:sz w:val="26"/>
+        </w:rPr>
+        <w:t xml:space="preserve"> Nắm quyền điều phối chính sách toàn cục (</w:t>
+      </w:r>
+      <w:r>
+        <w:rPr>
+          <w:rFonts w:ascii="Times New Roman" w:hAnsi="Times New Roman" w:eastAsia="Times New Roman"/>
+          <w:b/>
+          <w:i w:val="0"/>
+          <w:color w:val="000000"/>
+          <w:sz w:val="26"/>
+        </w:rPr>
+        <w:t>system_policies</w:t>
+      </w:r>
+      <w:r>
+        <w:rPr>
+          <w:rFonts w:ascii="Times New Roman" w:hAnsi="Times New Roman" w:eastAsia="Times New Roman"/>
+          <w:b w:val="0"/>
+          <w:i w:val="0"/>
+          <w:color w:val="000000"/>
+          <w:sz w:val="26"/>
+        </w:rPr>
+        <w:t>).</w:t>
+      </w:r>
+    </w:p>
     <w:sectPr>
       <w:pgSz w:w="11906" w:h="16838"/>
       <w:pgMar w:top="1134" w:right="1134" w:bottom="1134" w:left="1701" w:header="720" w:footer="720" w:gutter="0"/>

</xml_diff>